<commit_message>
docs: update final defense deck and speech
</commit_message>
<xml_diff>
--- a/handoff/final_defense_20260813/final_defense_speech.docx
+++ b/handoff/final_defense_20260813/final_defense_speech.docx
@@ -4,1108 +4,2001 @@
   <w:body>
     <w:p>
       <w:pPr>
-        <w:jc w:val="center"/>
+        <w:spacing w:after="80"/>
+        <w:jc w:val="left"/>
       </w:pPr>
       <w:r>
         <w:rPr>
-          <w:rFonts w:ascii="Microsoft YaHei" w:hAnsi="Microsoft YaHei" w:eastAsia="Microsoft YaHei"/>
+          <w:rFonts w:ascii="Calibri" w:hAnsi="Calibri" w:eastAsia="Microsoft YaHei"/>
           <w:b/>
-          <w:color w:val="103878"/>
-          <w:sz w:val="44"/>
+          <w:color w:val="123C73"/>
+          <w:sz w:val="48"/>
         </w:rPr>
-        <w:t>CICC1001959 区域赛决赛演讲稿</w:t>
+        <w:t>亿瞳智视决赛答辩逐页讲稿</w:t>
       </w:r>
     </w:p>
     <w:p>
       <w:pPr>
-        <w:jc w:val="center"/>
+        <w:spacing w:after="240"/>
       </w:pPr>
       <w:r>
         <w:rPr>
-          <w:rFonts w:ascii="Microsoft YaHei" w:hAnsi="Microsoft YaHei" w:eastAsia="Microsoft YaHei"/>
-          <w:b/>
-          <w:color w:val="323232"/>
-          <w:sz w:val="28"/>
+          <w:rFonts w:ascii="Calibri" w:hAnsi="Calibri" w:eastAsia="Microsoft YaHei"/>
+          <w:color w:val="5B6775"/>
+          <w:sz w:val="22"/>
         </w:rPr>
-        <w:t>虚拟物品抓取主线融合版</w:t>
+        <w:t>对应《CICC1001959_亿瞳智视_决赛答辩_终版》</w:t>
       </w:r>
     </w:p>
     <w:p>
       <w:pPr>
-        <w:spacing w:after="200"/>
+        <w:spacing w:after="360"/>
       </w:pPr>
       <w:r>
         <w:rPr>
-          <w:rFonts w:ascii="Microsoft YaHei" w:hAnsi="Microsoft YaHei" w:eastAsia="Microsoft YaHei"/>
-          <w:b w:val="0"/>
-          <w:color w:val="464646"/>
+          <w:rFonts w:ascii="Calibri" w:hAnsi="Calibri" w:eastAsia="Microsoft YaHei"/>
+          <w:b/>
+          <w:color w:val="247A35"/>
           <w:sz w:val="20"/>
         </w:rPr>
-        <w:t>对应文件：CICC1001959_区域赛决赛_PPT_完整版_20260723.pptx</w:t>
-        <w:br/>
-        <w:t>共 24 页，已将“虚拟物品抓取主线”融入逐页讲解结构，可直接用于现场答辩。</w:t>
+        <w:t>建议总时长：约 9 分钟  |  19 页逐页口播版</w:t>
       </w:r>
     </w:p>
     <w:p>
       <w:pPr>
-        <w:keepNext/>
-        <w:spacing w:before="160" w:after="20"/>
+        <w:spacing w:after="280" w:line="288" w:lineRule="auto"/>
       </w:pPr>
       <w:r>
         <w:rPr>
-          <w:rFonts w:ascii="Microsoft YaHei" w:hAnsi="Microsoft YaHei" w:eastAsia="Microsoft YaHei"/>
-          <w:b/>
-          <w:color w:val="103878"/>
-          <w:sz w:val="25"/>
+          <w:rFonts w:ascii="Calibri" w:hAnsi="Calibri" w:eastAsia="Microsoft YaHei"/>
+          <w:color w:val="34495E"/>
+          <w:sz w:val="21"/>
         </w:rPr>
-        <w:t>01｜封面</w:t>
+        <w:t>稿子按自然答辩语速编排，页尾句已经承担翻页衔接。排练时不必逐字背诵，保留数字、因果关系和状态说明即可。</w:t>
       </w:r>
     </w:p>
     <w:p>
       <w:pPr>
+        <w:pStyle w:val="Heading1"/>
         <w:keepNext/>
-        <w:spacing w:after="40"/>
       </w:pPr>
       <w:r>
         <w:rPr>
-          <w:rFonts w:ascii="Microsoft YaHei" w:hAnsi="Microsoft YaHei" w:eastAsia="Microsoft YaHei"/>
-          <w:b/>
-          <w:color w:val="323232"/>
-          <w:sz w:val="21"/>
+          <w:rFonts w:ascii="Calibri" w:hAnsi="Calibri" w:eastAsia="Microsoft YaHei"/>
         </w:rPr>
-        <w:t>国产 FPGA 确定性实时视觉与 VR 空间交互平台</w:t>
+        <w:t>第 01 页  |  亿瞳智视</w:t>
       </w:r>
+    </w:p>
+    <w:tbl>
+      <w:tblPr>
+        <w:tblStyle w:val="TableGrid"/>
+        <w:tblW w:type="dxa" w:w="9360"/>
+        <w:tblLayout w:type="fixed"/>
+        <w:tblLook w:firstColumn="1" w:firstRow="1" w:lastColumn="0" w:lastRow="0" w:noHBand="0" w:noVBand="1" w:val="04A0"/>
+        <w:tblInd w:w="120" w:type="dxa"/>
+      </w:tblPr>
+      <w:tblGrid>
+        <w:gridCol w:w="1320"/>
+        <w:gridCol w:w="8040"/>
+      </w:tblGrid>
+      <w:tr>
+        <w:tc>
+          <w:tcPr>
+            <w:tcW w:type="dxa" w:w="1320"/>
+            <w:tcMar>
+              <w:top w:w="100" w:type="dxa"/>
+              <w:start w:w="120" w:type="dxa"/>
+              <w:bottom w:w="100" w:type="dxa"/>
+              <w:end w:w="120" w:type="dxa"/>
+            </w:tcMar>
+            <w:shd w:fill="123C73"/>
+            <w:tcBorders>
+              <w:top w:val="single" w:sz="6" w:color="D8E1EC"/>
+              <w:start w:val="single" w:sz="6" w:color="D8E1EC"/>
+              <w:bottom w:val="single" w:sz="6" w:color="D8E1EC"/>
+              <w:end w:val="single" w:sz="6" w:color="D8E1EC"/>
+              <w:insideH w:val="single" w:sz="6" w:color="D8E1EC"/>
+              <w:insideV w:val="single" w:sz="6" w:color="D8E1EC"/>
+            </w:tcBorders>
+          </w:tcPr>
+          <w:p>
+            <w:pPr>
+              <w:spacing w:before="40" w:after="40" w:line="240" w:lineRule="auto"/>
+              <w:jc w:val="center"/>
+              <w:keepNext/>
+            </w:pPr>
+            <w:r>
+              <w:rPr>
+                <w:rFonts w:ascii="Calibri" w:hAnsi="Calibri" w:eastAsia="Microsoft YaHei"/>
+                <w:b/>
+                <w:color w:val="FFFFFF"/>
+                <w:sz w:val="20"/>
+              </w:rPr>
+              <w:t>20 秒</w:t>
+            </w:r>
+          </w:p>
+        </w:tc>
+        <w:tc>
+          <w:tcPr>
+            <w:tcW w:type="dxa" w:w="8040"/>
+            <w:tcMar>
+              <w:top w:w="100" w:type="dxa"/>
+              <w:start w:w="120" w:type="dxa"/>
+              <w:bottom w:w="100" w:type="dxa"/>
+              <w:end w:w="120" w:type="dxa"/>
+            </w:tcMar>
+            <w:shd w:fill="F4F7FA"/>
+            <w:tcBorders>
+              <w:top w:val="single" w:sz="6" w:color="D8E1EC"/>
+              <w:start w:val="single" w:sz="6" w:color="D8E1EC"/>
+              <w:bottom w:val="single" w:sz="6" w:color="D8E1EC"/>
+              <w:end w:val="single" w:sz="6" w:color="D8E1EC"/>
+              <w:insideH w:val="single" w:sz="6" w:color="D8E1EC"/>
+              <w:insideV w:val="single" w:sz="6" w:color="D8E1EC"/>
+            </w:tcBorders>
+          </w:tcPr>
+          <w:p>
+            <w:pPr>
+              <w:spacing w:before="20" w:after="20" w:line="300" w:lineRule="auto"/>
+              <w:keepNext/>
+            </w:pPr>
+            <w:r>
+              <w:rPr>
+                <w:rFonts w:ascii="Calibri" w:hAnsi="Calibri" w:eastAsia="Microsoft YaHei"/>
+                <w:color w:val="1F2933"/>
+                <w:sz w:val="22"/>
+              </w:rPr>
+              <w:t>各位评委老师好，我们是 CICC1001959 队，作品是“亿瞳智视——国产 FPGA 实时视觉与空间交互平台”。AI 大模型正在重塑人机交互的边界，推理延迟和调度抖动也随之变成了硬问题。VR 和空间交互尤其明显：画面只要晚一帧，坐标只要抖一下，用户就会感觉眩晕，动作也会脱节。我们想解决的，正是感知端的实时性。</w:t>
+            </w:r>
+          </w:p>
+        </w:tc>
+      </w:tr>
+    </w:tbl>
+    <w:p>
+      <w:pPr>
+        <w:spacing w:after="40"/>
+      </w:pPr>
     </w:p>
     <w:p>
       <w:pPr>
-        <w:spacing w:line="300" w:lineRule="auto" w:after="100"/>
-        <w:ind w:firstLine="420"/>
+        <w:pStyle w:val="Heading1"/>
+        <w:keepNext/>
       </w:pPr>
       <w:r>
         <w:rPr>
-          <w:rFonts w:ascii="Microsoft YaHei" w:hAnsi="Microsoft YaHei" w:eastAsia="Microsoft YaHei"/>
-          <w:b w:val="0"/>
-          <w:sz w:val="21"/>
+          <w:rFonts w:ascii="Calibri" w:hAnsi="Calibri" w:eastAsia="Microsoft YaHei"/>
         </w:rPr>
-        <w:t>各位评委老师好，我们是 CICC1001959 队伍，作品叫做“亿瞳智视”。本项目面向国产 FPGA 图像处理平台，构建从摄像头采集、实时增强、目标感知到 HDMI 显示和空间交互的完整系统。今天重点介绍其中最具交互特色的虚拟物品抓取：让摄像头看到的实体物体和人的动作，实时进入三维虚拟空间。</w:t>
+        <w:t>第 02 页  |  项目背景</w:t>
       </w:r>
+    </w:p>
+    <w:tbl>
+      <w:tblPr>
+        <w:tblStyle w:val="TableGrid"/>
+        <w:tblW w:type="dxa" w:w="9360"/>
+        <w:tblLayout w:type="fixed"/>
+        <w:tblLook w:firstColumn="1" w:firstRow="1" w:lastColumn="0" w:lastRow="0" w:noHBand="0" w:noVBand="1" w:val="04A0"/>
+        <w:tblInd w:w="120" w:type="dxa"/>
+      </w:tblPr>
+      <w:tblGrid>
+        <w:gridCol w:w="1320"/>
+        <w:gridCol w:w="8040"/>
+      </w:tblGrid>
+      <w:tr>
+        <w:tc>
+          <w:tcPr>
+            <w:tcW w:type="dxa" w:w="1320"/>
+            <w:tcMar>
+              <w:top w:w="100" w:type="dxa"/>
+              <w:start w:w="120" w:type="dxa"/>
+              <w:bottom w:w="100" w:type="dxa"/>
+              <w:end w:w="120" w:type="dxa"/>
+            </w:tcMar>
+            <w:shd w:fill="123C73"/>
+            <w:tcBorders>
+              <w:top w:val="single" w:sz="6" w:color="D8E1EC"/>
+              <w:start w:val="single" w:sz="6" w:color="D8E1EC"/>
+              <w:bottom w:val="single" w:sz="6" w:color="D8E1EC"/>
+              <w:end w:val="single" w:sz="6" w:color="D8E1EC"/>
+              <w:insideH w:val="single" w:sz="6" w:color="D8E1EC"/>
+              <w:insideV w:val="single" w:sz="6" w:color="D8E1EC"/>
+            </w:tcBorders>
+          </w:tcPr>
+          <w:p>
+            <w:pPr>
+              <w:spacing w:before="40" w:after="40" w:line="240" w:lineRule="auto"/>
+              <w:jc w:val="center"/>
+              <w:keepNext/>
+            </w:pPr>
+            <w:r>
+              <w:rPr>
+                <w:rFonts w:ascii="Calibri" w:hAnsi="Calibri" w:eastAsia="Microsoft YaHei"/>
+                <w:b/>
+                <w:color w:val="FFFFFF"/>
+                <w:sz w:val="20"/>
+              </w:rPr>
+              <w:t>30 秒</w:t>
+            </w:r>
+          </w:p>
+        </w:tc>
+        <w:tc>
+          <w:tcPr>
+            <w:tcW w:type="dxa" w:w="8040"/>
+            <w:tcMar>
+              <w:top w:w="100" w:type="dxa"/>
+              <w:start w:w="120" w:type="dxa"/>
+              <w:bottom w:w="100" w:type="dxa"/>
+              <w:end w:w="120" w:type="dxa"/>
+            </w:tcMar>
+            <w:shd w:fill="F4F7FA"/>
+            <w:tcBorders>
+              <w:top w:val="single" w:sz="6" w:color="D8E1EC"/>
+              <w:start w:val="single" w:sz="6" w:color="D8E1EC"/>
+              <w:bottom w:val="single" w:sz="6" w:color="D8E1EC"/>
+              <w:end w:val="single" w:sz="6" w:color="D8E1EC"/>
+              <w:insideH w:val="single" w:sz="6" w:color="D8E1EC"/>
+              <w:insideV w:val="single" w:sz="6" w:color="D8E1EC"/>
+            </w:tcBorders>
+          </w:tcPr>
+          <w:p>
+            <w:pPr>
+              <w:spacing w:before="20" w:after="20" w:line="300" w:lineRule="auto"/>
+              <w:keepNext/>
+            </w:pPr>
+            <w:r>
+              <w:rPr>
+                <w:rFonts w:ascii="Calibri" w:hAnsi="Calibri" w:eastAsia="Microsoft YaHei"/>
+                <w:color w:val="1F2933"/>
+                <w:sz w:val="22"/>
+              </w:rPr>
+              <w:t>VR 的核心挑战是感知实时性。CPU 和 GPU 方案会遇到系统调度、缓存竞争和渲染管线的抖动，现场交互很难保证每一帧都按时完成。我们把问题落到自己的板卡上以后，又多了一层约束：画面要连续，坐标要稳定，抓取和释放要接得上，动作状态还要同步，开发板本身也没有 DDR。于是项目一开始就定下了四个工程底线：实时画面、确定坐标、连续状态、片上运行。</w:t>
+            </w:r>
+          </w:p>
+        </w:tc>
+      </w:tr>
+    </w:tbl>
+    <w:p>
+      <w:pPr>
+        <w:spacing w:after="40"/>
+      </w:pPr>
     </w:p>
     <w:p>
       <w:pPr>
+        <w:pStyle w:val="Heading1"/>
         <w:keepNext/>
-        <w:spacing w:before="160" w:after="20"/>
       </w:pPr>
       <w:r>
         <w:rPr>
-          <w:rFonts w:ascii="Microsoft YaHei" w:hAnsi="Microsoft YaHei" w:eastAsia="Microsoft YaHei"/>
-          <w:b/>
-          <w:color w:val="103878"/>
-          <w:sz w:val="25"/>
+          <w:rFonts w:ascii="Calibri" w:hAnsi="Calibri" w:eastAsia="Microsoft YaHei"/>
         </w:rPr>
-        <w:t>02｜项目背景</w:t>
+        <w:t>第 03 页  |  三项创新</w:t>
       </w:r>
+    </w:p>
+    <w:tbl>
+      <w:tblPr>
+        <w:tblStyle w:val="TableGrid"/>
+        <w:tblW w:type="dxa" w:w="9360"/>
+        <w:tblLayout w:type="fixed"/>
+        <w:tblLook w:firstColumn="1" w:firstRow="1" w:lastColumn="0" w:lastRow="0" w:noHBand="0" w:noVBand="1" w:val="04A0"/>
+        <w:tblInd w:w="120" w:type="dxa"/>
+      </w:tblPr>
+      <w:tblGrid>
+        <w:gridCol w:w="1320"/>
+        <w:gridCol w:w="8040"/>
+      </w:tblGrid>
+      <w:tr>
+        <w:tc>
+          <w:tcPr>
+            <w:tcW w:type="dxa" w:w="1320"/>
+            <w:tcMar>
+              <w:top w:w="100" w:type="dxa"/>
+              <w:start w:w="120" w:type="dxa"/>
+              <w:bottom w:w="100" w:type="dxa"/>
+              <w:end w:w="120" w:type="dxa"/>
+            </w:tcMar>
+            <w:shd w:fill="123C73"/>
+            <w:tcBorders>
+              <w:top w:val="single" w:sz="6" w:color="D8E1EC"/>
+              <w:start w:val="single" w:sz="6" w:color="D8E1EC"/>
+              <w:bottom w:val="single" w:sz="6" w:color="D8E1EC"/>
+              <w:end w:val="single" w:sz="6" w:color="D8E1EC"/>
+              <w:insideH w:val="single" w:sz="6" w:color="D8E1EC"/>
+              <w:insideV w:val="single" w:sz="6" w:color="D8E1EC"/>
+            </w:tcBorders>
+          </w:tcPr>
+          <w:p>
+            <w:pPr>
+              <w:spacing w:before="40" w:after="40" w:line="240" w:lineRule="auto"/>
+              <w:jc w:val="center"/>
+              <w:keepNext/>
+            </w:pPr>
+            <w:r>
+              <w:rPr>
+                <w:rFonts w:ascii="Calibri" w:hAnsi="Calibri" w:eastAsia="Microsoft YaHei"/>
+                <w:b/>
+                <w:color w:val="FFFFFF"/>
+                <w:sz w:val="20"/>
+              </w:rPr>
+              <w:t>30 秒</w:t>
+            </w:r>
+          </w:p>
+        </w:tc>
+        <w:tc>
+          <w:tcPr>
+            <w:tcW w:type="dxa" w:w="8040"/>
+            <w:tcMar>
+              <w:top w:w="100" w:type="dxa"/>
+              <w:start w:w="120" w:type="dxa"/>
+              <w:bottom w:w="100" w:type="dxa"/>
+              <w:end w:w="120" w:type="dxa"/>
+            </w:tcMar>
+            <w:shd w:fill="F4F7FA"/>
+            <w:tcBorders>
+              <w:top w:val="single" w:sz="6" w:color="D8E1EC"/>
+              <w:start w:val="single" w:sz="6" w:color="D8E1EC"/>
+              <w:bottom w:val="single" w:sz="6" w:color="D8E1EC"/>
+              <w:end w:val="single" w:sz="6" w:color="D8E1EC"/>
+              <w:insideH w:val="single" w:sz="6" w:color="D8E1EC"/>
+              <w:insideV w:val="single" w:sz="6" w:color="D8E1EC"/>
+            </w:tcBorders>
+          </w:tcPr>
+          <w:p>
+            <w:pPr>
+              <w:spacing w:before="20" w:after="20" w:line="300" w:lineRule="auto"/>
+              <w:keepNext/>
+            </w:pPr>
+            <w:r>
+              <w:rPr>
+                <w:rFonts w:ascii="Calibri" w:hAnsi="Calibri" w:eastAsia="Microsoft YaHei"/>
+                <w:color w:val="1F2933"/>
+                <w:sz w:val="22"/>
+              </w:rPr>
+              <w:t>FPGA 的优势在于，算法可以在硬件上并行展开，结果按确定的时序向后传递。我们把这条视觉链路接到三个场景上：亮点坐标送到 F407 和云台，实体圆柱与蓝色手势进入 VR 保龄球，纸偶旁的蓝色标志物驱动孙悟空的动作帧。三种交互的外观差别很大，前面共用的都是采集、处理、坐标、状态和 HDMI。</w:t>
+            </w:r>
+          </w:p>
+        </w:tc>
+      </w:tr>
+    </w:tbl>
+    <w:p>
+      <w:pPr>
+        <w:spacing w:after="40"/>
+      </w:pPr>
     </w:p>
     <w:p>
       <w:pPr>
+        <w:pStyle w:val="Heading1"/>
         <w:keepNext/>
-        <w:spacing w:after="40"/>
       </w:pPr>
       <w:r>
         <w:rPr>
-          <w:rFonts w:ascii="Microsoft YaHei" w:hAnsi="Microsoft YaHei" w:eastAsia="Microsoft YaHei"/>
-          <w:b/>
-          <w:color w:val="323232"/>
-          <w:sz w:val="21"/>
+          <w:rFonts w:ascii="Calibri" w:hAnsi="Calibri" w:eastAsia="Microsoft YaHei"/>
         </w:rPr>
-        <w:t>空间计算需要稳定、连续、可反馈的实时感知</w:t>
+        <w:t>第 04 页  |  成果总览</w:t>
       </w:r>
+    </w:p>
+    <w:tbl>
+      <w:tblPr>
+        <w:tblStyle w:val="TableGrid"/>
+        <w:tblW w:type="dxa" w:w="9360"/>
+        <w:tblLayout w:type="fixed"/>
+        <w:tblLook w:firstColumn="1" w:firstRow="1" w:lastColumn="0" w:lastRow="0" w:noHBand="0" w:noVBand="1" w:val="04A0"/>
+        <w:tblInd w:w="120" w:type="dxa"/>
+      </w:tblPr>
+      <w:tblGrid>
+        <w:gridCol w:w="1320"/>
+        <w:gridCol w:w="8040"/>
+      </w:tblGrid>
+      <w:tr>
+        <w:tc>
+          <w:tcPr>
+            <w:tcW w:type="dxa" w:w="1320"/>
+            <w:tcMar>
+              <w:top w:w="100" w:type="dxa"/>
+              <w:start w:w="120" w:type="dxa"/>
+              <w:bottom w:w="100" w:type="dxa"/>
+              <w:end w:w="120" w:type="dxa"/>
+            </w:tcMar>
+            <w:shd w:fill="123C73"/>
+            <w:tcBorders>
+              <w:top w:val="single" w:sz="6" w:color="D8E1EC"/>
+              <w:start w:val="single" w:sz="6" w:color="D8E1EC"/>
+              <w:bottom w:val="single" w:sz="6" w:color="D8E1EC"/>
+              <w:end w:val="single" w:sz="6" w:color="D8E1EC"/>
+              <w:insideH w:val="single" w:sz="6" w:color="D8E1EC"/>
+              <w:insideV w:val="single" w:sz="6" w:color="D8E1EC"/>
+            </w:tcBorders>
+          </w:tcPr>
+          <w:p>
+            <w:pPr>
+              <w:spacing w:before="40" w:after="40" w:line="240" w:lineRule="auto"/>
+              <w:jc w:val="center"/>
+              <w:keepNext/>
+            </w:pPr>
+            <w:r>
+              <w:rPr>
+                <w:rFonts w:ascii="Calibri" w:hAnsi="Calibri" w:eastAsia="Microsoft YaHei"/>
+                <w:b/>
+                <w:color w:val="FFFFFF"/>
+                <w:sz w:val="20"/>
+              </w:rPr>
+              <w:t>25 秒</w:t>
+            </w:r>
+          </w:p>
+        </w:tc>
+        <w:tc>
+          <w:tcPr>
+            <w:tcW w:type="dxa" w:w="8040"/>
+            <w:tcMar>
+              <w:top w:w="100" w:type="dxa"/>
+              <w:start w:w="120" w:type="dxa"/>
+              <w:bottom w:w="100" w:type="dxa"/>
+              <w:end w:w="120" w:type="dxa"/>
+            </w:tcMar>
+            <w:shd w:fill="F4F7FA"/>
+            <w:tcBorders>
+              <w:top w:val="single" w:sz="6" w:color="D8E1EC"/>
+              <w:start w:val="single" w:sz="6" w:color="D8E1EC"/>
+              <w:bottom w:val="single" w:sz="6" w:color="D8E1EC"/>
+              <w:end w:val="single" w:sz="6" w:color="D8E1EC"/>
+              <w:insideH w:val="single" w:sz="6" w:color="D8E1EC"/>
+              <w:insideV w:val="single" w:sz="6" w:color="D8E1EC"/>
+            </w:tcBorders>
+          </w:tcPr>
+          <w:p>
+            <w:pPr>
+              <w:spacing w:before="20" w:after="20" w:line="300" w:lineRule="auto"/>
+              <w:keepNext/>
+            </w:pPr>
+            <w:r>
+              <w:rPr>
+                <w:rFonts w:ascii="Calibri" w:hAnsi="Calibri" w:eastAsia="Microsoft YaHei"/>
+                <w:color w:val="1F2933"/>
+                <w:sz w:val="22"/>
+              </w:rPr>
+              <w:t>这套方案最后落在几组可以核对的结果上：OV5640 到 FPGA 再到 HDMI 的 1280×720 实时视频链路，14 项基础算法加 4 项进阶算法，三项交互演示，以及 22/22 通过的上位机协议测试。逻辑单元占用 22%，DSP 占用 4%，片上存储使用 1.93 Mbit。后面分别给出链路、算法和演示证据。</w:t>
+            </w:r>
+          </w:p>
+        </w:tc>
+      </w:tr>
+    </w:tbl>
+    <w:p>
+      <w:pPr>
+        <w:spacing w:after="40"/>
+      </w:pPr>
     </w:p>
     <w:p>
       <w:pPr>
-        <w:spacing w:line="300" w:lineRule="auto" w:after="100"/>
-        <w:ind w:firstLine="420"/>
+        <w:pStyle w:val="Heading1"/>
+        <w:keepNext/>
       </w:pPr>
       <w:r>
         <w:rPr>
-          <w:rFonts w:ascii="Microsoft YaHei" w:hAnsi="Microsoft YaHei" w:eastAsia="Microsoft YaHei"/>
-          <w:b w:val="0"/>
-          <w:sz w:val="21"/>
+          <w:rFonts w:ascii="Calibri" w:hAnsi="Calibri" w:eastAsia="Microsoft YaHei"/>
         </w:rPr>
-        <w:t>VR、AR、训练仿真和空间计算不只是把画面显示出来，还要求动作进入后稳定、连续地反馈。我们把关键视觉处理放到 FPGA 流水线上，减少调度和数据搬运带来的不确定性。最终目标是让系统能够看清现实、理解空间，并把结果直接变成可交互的空间信息。</w:t>
+        <w:t>第 05 页  |  视频链路</w:t>
       </w:r>
+    </w:p>
+    <w:tbl>
+      <w:tblPr>
+        <w:tblStyle w:val="TableGrid"/>
+        <w:tblW w:type="dxa" w:w="9360"/>
+        <w:tblLayout w:type="fixed"/>
+        <w:tblLook w:firstColumn="1" w:firstRow="1" w:lastColumn="0" w:lastRow="0" w:noHBand="0" w:noVBand="1" w:val="04A0"/>
+        <w:tblInd w:w="120" w:type="dxa"/>
+      </w:tblPr>
+      <w:tblGrid>
+        <w:gridCol w:w="1320"/>
+        <w:gridCol w:w="8040"/>
+      </w:tblGrid>
+      <w:tr>
+        <w:tc>
+          <w:tcPr>
+            <w:tcW w:type="dxa" w:w="1320"/>
+            <w:tcMar>
+              <w:top w:w="100" w:type="dxa"/>
+              <w:start w:w="120" w:type="dxa"/>
+              <w:bottom w:w="100" w:type="dxa"/>
+              <w:end w:w="120" w:type="dxa"/>
+            </w:tcMar>
+            <w:shd w:fill="123C73"/>
+            <w:tcBorders>
+              <w:top w:val="single" w:sz="6" w:color="D8E1EC"/>
+              <w:start w:val="single" w:sz="6" w:color="D8E1EC"/>
+              <w:bottom w:val="single" w:sz="6" w:color="D8E1EC"/>
+              <w:end w:val="single" w:sz="6" w:color="D8E1EC"/>
+              <w:insideH w:val="single" w:sz="6" w:color="D8E1EC"/>
+              <w:insideV w:val="single" w:sz="6" w:color="D8E1EC"/>
+            </w:tcBorders>
+          </w:tcPr>
+          <w:p>
+            <w:pPr>
+              <w:spacing w:before="40" w:after="40" w:line="240" w:lineRule="auto"/>
+              <w:jc w:val="center"/>
+              <w:keepNext/>
+            </w:pPr>
+            <w:r>
+              <w:rPr>
+                <w:rFonts w:ascii="Calibri" w:hAnsi="Calibri" w:eastAsia="Microsoft YaHei"/>
+                <w:b/>
+                <w:color w:val="FFFFFF"/>
+                <w:sz w:val="20"/>
+              </w:rPr>
+              <w:t>35 秒</w:t>
+            </w:r>
+          </w:p>
+        </w:tc>
+        <w:tc>
+          <w:tcPr>
+            <w:tcW w:type="dxa" w:w="8040"/>
+            <w:tcMar>
+              <w:top w:w="100" w:type="dxa"/>
+              <w:start w:w="120" w:type="dxa"/>
+              <w:bottom w:w="100" w:type="dxa"/>
+              <w:end w:w="120" w:type="dxa"/>
+            </w:tcMar>
+            <w:shd w:fill="F4F7FA"/>
+            <w:tcBorders>
+              <w:top w:val="single" w:sz="6" w:color="D8E1EC"/>
+              <w:start w:val="single" w:sz="6" w:color="D8E1EC"/>
+              <w:bottom w:val="single" w:sz="6" w:color="D8E1EC"/>
+              <w:end w:val="single" w:sz="6" w:color="D8E1EC"/>
+              <w:insideH w:val="single" w:sz="6" w:color="D8E1EC"/>
+              <w:insideV w:val="single" w:sz="6" w:color="D8E1EC"/>
+            </w:tcBorders>
+          </w:tcPr>
+          <w:p>
+            <w:pPr>
+              <w:spacing w:before="20" w:after="20" w:line="300" w:lineRule="auto"/>
+              <w:keepNext/>
+            </w:pPr>
+            <w:r>
+              <w:rPr>
+                <w:rFonts w:ascii="Calibri" w:hAnsi="Calibri" w:eastAsia="Microsoft YaHei"/>
+                <w:color w:val="1F2933"/>
+                <w:sz w:val="22"/>
+              </w:rPr>
+              <w:t>先看视频数据流。OV5640 采集图像，双 SDRAM 做乒乓缓存，增强、变换和识别算法插在像素流中间，最后从 HDMI 或 UDP 输出。另一条配置与执行链路通过 UART 传递角度、矩阵和增益，参数在帧边界锁存，切换算法时画面保持连续。识别结果再交给上位机、F407、云台或激光端。所有演示都建立在这条底线上。</w:t>
+            </w:r>
+          </w:p>
+        </w:tc>
+      </w:tr>
+    </w:tbl>
+    <w:p>
+      <w:pPr>
+        <w:spacing w:after="40"/>
+      </w:pPr>
     </w:p>
     <w:p>
       <w:pPr>
+        <w:pStyle w:val="Heading1"/>
         <w:keepNext/>
-        <w:spacing w:before="160" w:after="20"/>
       </w:pPr>
       <w:r>
         <w:rPr>
-          <w:rFonts w:ascii="Microsoft YaHei" w:hAnsi="Microsoft YaHei" w:eastAsia="Microsoft YaHei"/>
-          <w:b/>
-          <w:color w:val="103878"/>
-          <w:sz w:val="25"/>
+          <w:rFonts w:ascii="Calibri" w:hAnsi="Calibri" w:eastAsia="Microsoft YaHei"/>
         </w:rPr>
-        <w:t>03｜成果总览</w:t>
+        <w:t>第 06 页  |  算法底座</w:t>
       </w:r>
+    </w:p>
+    <w:tbl>
+      <w:tblPr>
+        <w:tblStyle w:val="TableGrid"/>
+        <w:tblW w:type="dxa" w:w="9360"/>
+        <w:tblLayout w:type="fixed"/>
+        <w:tblLook w:firstColumn="1" w:firstRow="1" w:lastColumn="0" w:lastRow="0" w:noHBand="0" w:noVBand="1" w:val="04A0"/>
+        <w:tblInd w:w="120" w:type="dxa"/>
+      </w:tblPr>
+      <w:tblGrid>
+        <w:gridCol w:w="1320"/>
+        <w:gridCol w:w="8040"/>
+      </w:tblGrid>
+      <w:tr>
+        <w:tc>
+          <w:tcPr>
+            <w:tcW w:type="dxa" w:w="1320"/>
+            <w:tcMar>
+              <w:top w:w="100" w:type="dxa"/>
+              <w:start w:w="120" w:type="dxa"/>
+              <w:bottom w:w="100" w:type="dxa"/>
+              <w:end w:w="120" w:type="dxa"/>
+            </w:tcMar>
+            <w:shd w:fill="123C73"/>
+            <w:tcBorders>
+              <w:top w:val="single" w:sz="6" w:color="D8E1EC"/>
+              <w:start w:val="single" w:sz="6" w:color="D8E1EC"/>
+              <w:bottom w:val="single" w:sz="6" w:color="D8E1EC"/>
+              <w:end w:val="single" w:sz="6" w:color="D8E1EC"/>
+              <w:insideH w:val="single" w:sz="6" w:color="D8E1EC"/>
+              <w:insideV w:val="single" w:sz="6" w:color="D8E1EC"/>
+            </w:tcBorders>
+          </w:tcPr>
+          <w:p>
+            <w:pPr>
+              <w:spacing w:before="40" w:after="40" w:line="240" w:lineRule="auto"/>
+              <w:jc w:val="center"/>
+              <w:keepNext/>
+            </w:pPr>
+            <w:r>
+              <w:rPr>
+                <w:rFonts w:ascii="Calibri" w:hAnsi="Calibri" w:eastAsia="Microsoft YaHei"/>
+                <w:b/>
+                <w:color w:val="FFFFFF"/>
+                <w:sz w:val="20"/>
+              </w:rPr>
+              <w:t>35 秒</w:t>
+            </w:r>
+          </w:p>
+        </w:tc>
+        <w:tc>
+          <w:tcPr>
+            <w:tcW w:type="dxa" w:w="8040"/>
+            <w:tcMar>
+              <w:top w:w="100" w:type="dxa"/>
+              <w:start w:w="120" w:type="dxa"/>
+              <w:bottom w:w="100" w:type="dxa"/>
+              <w:end w:w="120" w:type="dxa"/>
+            </w:tcMar>
+            <w:shd w:fill="F4F7FA"/>
+            <w:tcBorders>
+              <w:top w:val="single" w:sz="6" w:color="D8E1EC"/>
+              <w:start w:val="single" w:sz="6" w:color="D8E1EC"/>
+              <w:bottom w:val="single" w:sz="6" w:color="D8E1EC"/>
+              <w:end w:val="single" w:sz="6" w:color="D8E1EC"/>
+              <w:insideH w:val="single" w:sz="6" w:color="D8E1EC"/>
+              <w:insideV w:val="single" w:sz="6" w:color="D8E1EC"/>
+            </w:tcBorders>
+          </w:tcPr>
+          <w:p>
+            <w:pPr>
+              <w:spacing w:before="20" w:after="20" w:line="300" w:lineRule="auto"/>
+              <w:keepNext/>
+            </w:pPr>
+            <w:r>
+              <w:rPr>
+                <w:rFonts w:ascii="Calibri" w:hAnsi="Calibri" w:eastAsia="Microsoft YaHei"/>
+                <w:color w:val="1F2933"/>
+                <w:sz w:val="22"/>
+              </w:rPr>
+              <w:t>画面稳定以后，我们没有把三个演示各做一套算法。每个进阶场景都由基础能力组合出来：颜色增强走 YCbCr 亮度路径，目标交互走颜色分类到质心输出，旋转走三角函数查表加逆向坐标映射，光照增强走局部照明估计和流水混合。最后把这些职责收拢成四条可复用处理链：颜色、区域、坐标、照明。</w:t>
+            </w:r>
+          </w:p>
+        </w:tc>
+      </w:tr>
+    </w:tbl>
+    <w:p>
+      <w:pPr>
+        <w:spacing w:after="40"/>
+      </w:pPr>
     </w:p>
     <w:p>
       <w:pPr>
+        <w:pStyle w:val="Heading1"/>
         <w:keepNext/>
-        <w:spacing w:after="40"/>
       </w:pPr>
       <w:r>
         <w:rPr>
-          <w:rFonts w:ascii="Microsoft YaHei" w:hAnsi="Microsoft YaHei" w:eastAsia="Microsoft YaHei"/>
-          <w:b/>
-          <w:color w:val="323232"/>
-          <w:sz w:val="21"/>
+          <w:rFonts w:ascii="Calibri" w:hAnsi="Calibri" w:eastAsia="Microsoft YaHei"/>
         </w:rPr>
-        <w:t>五项进阶算法，共享一套实时视觉底座</w:t>
+        <w:t>第 07 页  |  进阶算法</w:t>
       </w:r>
+    </w:p>
+    <w:tbl>
+      <w:tblPr>
+        <w:tblStyle w:val="TableGrid"/>
+        <w:tblW w:type="dxa" w:w="9360"/>
+        <w:tblLayout w:type="fixed"/>
+        <w:tblLook w:firstColumn="1" w:firstRow="1" w:lastColumn="0" w:lastRow="0" w:noHBand="0" w:noVBand="1" w:val="04A0"/>
+        <w:tblInd w:w="120" w:type="dxa"/>
+      </w:tblPr>
+      <w:tblGrid>
+        <w:gridCol w:w="1320"/>
+        <w:gridCol w:w="8040"/>
+      </w:tblGrid>
+      <w:tr>
+        <w:tc>
+          <w:tcPr>
+            <w:tcW w:type="dxa" w:w="1320"/>
+            <w:tcMar>
+              <w:top w:w="100" w:type="dxa"/>
+              <w:start w:w="120" w:type="dxa"/>
+              <w:bottom w:w="100" w:type="dxa"/>
+              <w:end w:w="120" w:type="dxa"/>
+            </w:tcMar>
+            <w:shd w:fill="123C73"/>
+            <w:tcBorders>
+              <w:top w:val="single" w:sz="6" w:color="D8E1EC"/>
+              <w:start w:val="single" w:sz="6" w:color="D8E1EC"/>
+              <w:bottom w:val="single" w:sz="6" w:color="D8E1EC"/>
+              <w:end w:val="single" w:sz="6" w:color="D8E1EC"/>
+              <w:insideH w:val="single" w:sz="6" w:color="D8E1EC"/>
+              <w:insideV w:val="single" w:sz="6" w:color="D8E1EC"/>
+            </w:tcBorders>
+          </w:tcPr>
+          <w:p>
+            <w:pPr>
+              <w:spacing w:before="40" w:after="40" w:line="240" w:lineRule="auto"/>
+              <w:jc w:val="center"/>
+              <w:keepNext/>
+            </w:pPr>
+            <w:r>
+              <w:rPr>
+                <w:rFonts w:ascii="Calibri" w:hAnsi="Calibri" w:eastAsia="Microsoft YaHei"/>
+                <w:b/>
+                <w:color w:val="FFFFFF"/>
+                <w:sz w:val="20"/>
+              </w:rPr>
+              <w:t>35 秒</w:t>
+            </w:r>
+          </w:p>
+        </w:tc>
+        <w:tc>
+          <w:tcPr>
+            <w:tcW w:type="dxa" w:w="8040"/>
+            <w:tcMar>
+              <w:top w:w="100" w:type="dxa"/>
+              <w:start w:w="120" w:type="dxa"/>
+              <w:bottom w:w="100" w:type="dxa"/>
+              <w:end w:w="120" w:type="dxa"/>
+            </w:tcMar>
+            <w:shd w:fill="F4F7FA"/>
+            <w:tcBorders>
+              <w:top w:val="single" w:sz="6" w:color="D8E1EC"/>
+              <w:start w:val="single" w:sz="6" w:color="D8E1EC"/>
+              <w:bottom w:val="single" w:sz="6" w:color="D8E1EC"/>
+              <w:end w:val="single" w:sz="6" w:color="D8E1EC"/>
+              <w:insideH w:val="single" w:sz="6" w:color="D8E1EC"/>
+              <w:insideV w:val="single" w:sz="6" w:color="D8E1EC"/>
+            </w:tcBorders>
+          </w:tcPr>
+          <w:p>
+            <w:pPr>
+              <w:spacing w:before="20" w:after="20" w:line="300" w:lineRule="auto"/>
+              <w:keepNext/>
+            </w:pPr>
+            <w:r>
+              <w:rPr>
+                <w:rFonts w:ascii="Calibri" w:hAnsi="Calibri" w:eastAsia="Microsoft YaHei"/>
+                <w:color w:val="1F2933"/>
+                <w:sz w:val="22"/>
+              </w:rPr>
+              <w:t>具体场景继续把算法往前推。低照环境里暗部结构会丢失，Retinex 用 I=R·L 的对数模型、3×3 高斯窗口和 Q8 近似恢复亮度层次，13 周期流水保证实时输出。亮区和暗区同时出现时，多曝光融合在 YCbCr 亮度域加权。视角变化带来随机访问问题，任意角旋转采用 480×270 工作集和双 Bank BRAM。最后，颜色分割、动态 ROI 与形态学把目标从复杂画面里筛出来。</w:t>
+            </w:r>
+          </w:p>
+        </w:tc>
+      </w:tr>
+    </w:tbl>
+    <w:p>
+      <w:pPr>
+        <w:spacing w:after="40"/>
+      </w:pPr>
     </w:p>
     <w:p>
       <w:pPr>
-        <w:spacing w:line="300" w:lineRule="auto" w:after="100"/>
-        <w:ind w:firstLine="420"/>
+        <w:pStyle w:val="Heading1"/>
+        <w:keepNext/>
       </w:pPr>
       <w:r>
         <w:rPr>
-          <w:rFonts w:ascii="Microsoft YaHei" w:hAnsi="Microsoft YaHei" w:eastAsia="Microsoft YaHei"/>
-          <w:b w:val="0"/>
-          <w:sz w:val="21"/>
+          <w:rFonts w:ascii="Calibri" w:hAnsi="Calibri" w:eastAsia="Microsoft YaHei"/>
         </w:rPr>
-        <w:t>平台完成了 Retinex 暗部增强、多曝光融合、实时任意角旋转、边缘与激光打靶，以及虚拟物品抓取五项进阶算法。它们是独立的应用模式，不是为了拼成一条固定流水线；五个场景共享稳定的视频采集、缓存、HDMI 显示和控制底座。下面以虚拟物品抓取为主线，其他算法作为支撑能力展开。</w:t>
+        <w:t>第 08 页  |  资源占用</w:t>
       </w:r>
+    </w:p>
+    <w:tbl>
+      <w:tblPr>
+        <w:tblStyle w:val="TableGrid"/>
+        <w:tblW w:type="dxa" w:w="9360"/>
+        <w:tblLayout w:type="fixed"/>
+        <w:tblLook w:firstColumn="1" w:firstRow="1" w:lastColumn="0" w:lastRow="0" w:noHBand="0" w:noVBand="1" w:val="04A0"/>
+        <w:tblInd w:w="120" w:type="dxa"/>
+      </w:tblPr>
+      <w:tblGrid>
+        <w:gridCol w:w="1320"/>
+        <w:gridCol w:w="8040"/>
+      </w:tblGrid>
+      <w:tr>
+        <w:tc>
+          <w:tcPr>
+            <w:tcW w:type="dxa" w:w="1320"/>
+            <w:tcMar>
+              <w:top w:w="100" w:type="dxa"/>
+              <w:start w:w="120" w:type="dxa"/>
+              <w:bottom w:w="100" w:type="dxa"/>
+              <w:end w:w="120" w:type="dxa"/>
+            </w:tcMar>
+            <w:shd w:fill="123C73"/>
+            <w:tcBorders>
+              <w:top w:val="single" w:sz="6" w:color="D8E1EC"/>
+              <w:start w:val="single" w:sz="6" w:color="D8E1EC"/>
+              <w:bottom w:val="single" w:sz="6" w:color="D8E1EC"/>
+              <w:end w:val="single" w:sz="6" w:color="D8E1EC"/>
+              <w:insideH w:val="single" w:sz="6" w:color="D8E1EC"/>
+              <w:insideV w:val="single" w:sz="6" w:color="D8E1EC"/>
+            </w:tcBorders>
+          </w:tcPr>
+          <w:p>
+            <w:pPr>
+              <w:spacing w:before="40" w:after="40" w:line="240" w:lineRule="auto"/>
+              <w:jc w:val="center"/>
+              <w:keepNext/>
+            </w:pPr>
+            <w:r>
+              <w:rPr>
+                <w:rFonts w:ascii="Calibri" w:hAnsi="Calibri" w:eastAsia="Microsoft YaHei"/>
+                <w:b/>
+                <w:color w:val="FFFFFF"/>
+                <w:sz w:val="20"/>
+              </w:rPr>
+              <w:t>30 秒</w:t>
+            </w:r>
+          </w:p>
+        </w:tc>
+        <w:tc>
+          <w:tcPr>
+            <w:tcW w:type="dxa" w:w="8040"/>
+            <w:tcMar>
+              <w:top w:w="100" w:type="dxa"/>
+              <w:start w:w="120" w:type="dxa"/>
+              <w:bottom w:w="100" w:type="dxa"/>
+              <w:end w:w="120" w:type="dxa"/>
+            </w:tcMar>
+            <w:shd w:fill="F4F7FA"/>
+            <w:tcBorders>
+              <w:top w:val="single" w:sz="6" w:color="D8E1EC"/>
+              <w:start w:val="single" w:sz="6" w:color="D8E1EC"/>
+              <w:bottom w:val="single" w:sz="6" w:color="D8E1EC"/>
+              <w:end w:val="single" w:sz="6" w:color="D8E1EC"/>
+              <w:insideH w:val="single" w:sz="6" w:color="D8E1EC"/>
+              <w:insideV w:val="single" w:sz="6" w:color="D8E1EC"/>
+            </w:tcBorders>
+          </w:tcPr>
+          <w:p>
+            <w:pPr>
+              <w:spacing w:before="20" w:after="20" w:line="300" w:lineRule="auto"/>
+              <w:keepNext/>
+            </w:pPr>
+            <w:r>
+              <w:rPr>
+                <w:rFonts w:ascii="Calibri" w:hAnsi="Calibri" w:eastAsia="Microsoft YaHei"/>
+                <w:color w:val="1F2933"/>
+                <w:sz w:val="22"/>
+              </w:rPr>
+              <w:t>开发板没有 DDR，所有资源都要在片上安排。逻辑单元使用 29,534 个，占 22%；片上存储使用 1.93 Mbit；DSP 使用 2 个，占 4%。定点运算、Q8 查表和片上缓存把乘法与随机访问的代价压下来，旋转模块还用 480×270 工作集保存图像窗口。算法能跑起来，执行端才有稳定的输入。</w:t>
+            </w:r>
+          </w:p>
+        </w:tc>
+      </w:tr>
+    </w:tbl>
+    <w:p>
+      <w:pPr>
+        <w:spacing w:after="40"/>
+      </w:pPr>
     </w:p>
     <w:p>
       <w:pPr>
+        <w:pStyle w:val="Heading1"/>
         <w:keepNext/>
-        <w:spacing w:before="160" w:after="20"/>
       </w:pPr>
       <w:r>
         <w:rPr>
-          <w:rFonts w:ascii="Microsoft YaHei" w:hAnsi="Microsoft YaHei" w:eastAsia="Microsoft YaHei"/>
-          <w:b/>
-          <w:color w:val="103878"/>
-          <w:sz w:val="25"/>
+          <w:rFonts w:ascii="Calibri" w:hAnsi="Calibri" w:eastAsia="Microsoft YaHei"/>
         </w:rPr>
-        <w:t>04｜现实物体成为 VR 入口</w:t>
+        <w:t>第 09 页  |  核心演示</w:t>
       </w:r>
+    </w:p>
+    <w:tbl>
+      <w:tblPr>
+        <w:tblStyle w:val="TableGrid"/>
+        <w:tblW w:type="dxa" w:w="9360"/>
+        <w:tblLayout w:type="fixed"/>
+        <w:tblLook w:firstColumn="1" w:firstRow="1" w:lastColumn="0" w:lastRow="0" w:noHBand="0" w:noVBand="1" w:val="04A0"/>
+        <w:tblInd w:w="120" w:type="dxa"/>
+      </w:tblPr>
+      <w:tblGrid>
+        <w:gridCol w:w="1320"/>
+        <w:gridCol w:w="8040"/>
+      </w:tblGrid>
+      <w:tr>
+        <w:tc>
+          <w:tcPr>
+            <w:tcW w:type="dxa" w:w="1320"/>
+            <w:tcMar>
+              <w:top w:w="100" w:type="dxa"/>
+              <w:start w:w="120" w:type="dxa"/>
+              <w:bottom w:w="100" w:type="dxa"/>
+              <w:end w:w="120" w:type="dxa"/>
+            </w:tcMar>
+            <w:shd w:fill="123C73"/>
+            <w:tcBorders>
+              <w:top w:val="single" w:sz="6" w:color="D8E1EC"/>
+              <w:start w:val="single" w:sz="6" w:color="D8E1EC"/>
+              <w:bottom w:val="single" w:sz="6" w:color="D8E1EC"/>
+              <w:end w:val="single" w:sz="6" w:color="D8E1EC"/>
+              <w:insideH w:val="single" w:sz="6" w:color="D8E1EC"/>
+              <w:insideV w:val="single" w:sz="6" w:color="D8E1EC"/>
+            </w:tcBorders>
+          </w:tcPr>
+          <w:p>
+            <w:pPr>
+              <w:spacing w:before="40" w:after="40" w:line="240" w:lineRule="auto"/>
+              <w:jc w:val="center"/>
+              <w:keepNext/>
+            </w:pPr>
+            <w:r>
+              <w:rPr>
+                <w:rFonts w:ascii="Calibri" w:hAnsi="Calibri" w:eastAsia="Microsoft YaHei"/>
+                <w:b/>
+                <w:color w:val="FFFFFF"/>
+                <w:sz w:val="20"/>
+              </w:rPr>
+              <w:t>15 秒</w:t>
+            </w:r>
+          </w:p>
+        </w:tc>
+        <w:tc>
+          <w:tcPr>
+            <w:tcW w:type="dxa" w:w="8040"/>
+            <w:tcMar>
+              <w:top w:w="100" w:type="dxa"/>
+              <w:start w:w="120" w:type="dxa"/>
+              <w:bottom w:w="100" w:type="dxa"/>
+              <w:end w:w="120" w:type="dxa"/>
+            </w:tcMar>
+            <w:shd w:fill="F4F7FA"/>
+            <w:tcBorders>
+              <w:top w:val="single" w:sz="6" w:color="D8E1EC"/>
+              <w:start w:val="single" w:sz="6" w:color="D8E1EC"/>
+              <w:bottom w:val="single" w:sz="6" w:color="D8E1EC"/>
+              <w:end w:val="single" w:sz="6" w:color="D8E1EC"/>
+              <w:insideH w:val="single" w:sz="6" w:color="D8E1EC"/>
+              <w:insideV w:val="single" w:sz="6" w:color="D8E1EC"/>
+            </w:tcBorders>
+          </w:tcPr>
+          <w:p>
+            <w:pPr>
+              <w:spacing w:before="20" w:after="20" w:line="300" w:lineRule="auto"/>
+              <w:keepNext/>
+            </w:pPr>
+            <w:r>
+              <w:rPr>
+                <w:rFonts w:ascii="Calibri" w:hAnsi="Calibri" w:eastAsia="Microsoft YaHei"/>
+                <w:color w:val="1F2933"/>
+                <w:sz w:val="22"/>
+              </w:rPr>
+              <w:t>前面讲的是基础链路和算法能力。接下来要看它们怎样进入现实动作：一个亮点能不能带着云台走？一只手能不能把球抓住、投出去？一个蓝色标志物能不能让纸偶旁的角色做出动作？三个演示，分别回答这三个问题。</w:t>
+            </w:r>
+          </w:p>
+        </w:tc>
+      </w:tr>
+    </w:tbl>
+    <w:p>
+      <w:pPr>
+        <w:spacing w:after="40"/>
+      </w:pPr>
     </w:p>
     <w:p>
       <w:pPr>
+        <w:pStyle w:val="Heading1"/>
         <w:keepNext/>
-        <w:spacing w:after="40"/>
       </w:pPr>
       <w:r>
         <w:rPr>
-          <w:rFonts w:ascii="Microsoft YaHei" w:hAnsi="Microsoft YaHei" w:eastAsia="Microsoft YaHei"/>
-          <w:b/>
-          <w:color w:val="323232"/>
-          <w:sz w:val="21"/>
+          <w:rFonts w:ascii="Calibri" w:hAnsi="Calibri" w:eastAsia="Microsoft YaHei"/>
         </w:rPr>
-        <w:t>实体物体和手势直接进入虚拟空间</w:t>
+        <w:t>第 10 页  |  云台追踪</w:t>
       </w:r>
+    </w:p>
+    <w:tbl>
+      <w:tblPr>
+        <w:tblStyle w:val="TableGrid"/>
+        <w:tblW w:type="dxa" w:w="9360"/>
+        <w:tblLayout w:type="fixed"/>
+        <w:tblLook w:firstColumn="1" w:firstRow="1" w:lastColumn="0" w:lastRow="0" w:noHBand="0" w:noVBand="1" w:val="04A0"/>
+        <w:tblInd w:w="120" w:type="dxa"/>
+      </w:tblPr>
+      <w:tblGrid>
+        <w:gridCol w:w="1320"/>
+        <w:gridCol w:w="8040"/>
+      </w:tblGrid>
+      <w:tr>
+        <w:tc>
+          <w:tcPr>
+            <w:tcW w:type="dxa" w:w="1320"/>
+            <w:tcMar>
+              <w:top w:w="100" w:type="dxa"/>
+              <w:start w:w="120" w:type="dxa"/>
+              <w:bottom w:w="100" w:type="dxa"/>
+              <w:end w:w="120" w:type="dxa"/>
+            </w:tcMar>
+            <w:shd w:fill="123C73"/>
+            <w:tcBorders>
+              <w:top w:val="single" w:sz="6" w:color="D8E1EC"/>
+              <w:start w:val="single" w:sz="6" w:color="D8E1EC"/>
+              <w:bottom w:val="single" w:sz="6" w:color="D8E1EC"/>
+              <w:end w:val="single" w:sz="6" w:color="D8E1EC"/>
+              <w:insideH w:val="single" w:sz="6" w:color="D8E1EC"/>
+              <w:insideV w:val="single" w:sz="6" w:color="D8E1EC"/>
+            </w:tcBorders>
+          </w:tcPr>
+          <w:p>
+            <w:pPr>
+              <w:spacing w:before="40" w:after="40" w:line="240" w:lineRule="auto"/>
+              <w:jc w:val="center"/>
+              <w:keepNext/>
+            </w:pPr>
+            <w:r>
+              <w:rPr>
+                <w:rFonts w:ascii="Calibri" w:hAnsi="Calibri" w:eastAsia="Microsoft YaHei"/>
+                <w:b/>
+                <w:color w:val="FFFFFF"/>
+                <w:sz w:val="20"/>
+              </w:rPr>
+              <w:t>40 秒</w:t>
+            </w:r>
+          </w:p>
+        </w:tc>
+        <w:tc>
+          <w:tcPr>
+            <w:tcW w:type="dxa" w:w="8040"/>
+            <w:tcMar>
+              <w:top w:w="100" w:type="dxa"/>
+              <w:start w:w="120" w:type="dxa"/>
+              <w:bottom w:w="100" w:type="dxa"/>
+              <w:end w:w="120" w:type="dxa"/>
+            </w:tcMar>
+            <w:shd w:fill="F4F7FA"/>
+            <w:tcBorders>
+              <w:top w:val="single" w:sz="6" w:color="D8E1EC"/>
+              <w:start w:val="single" w:sz="6" w:color="D8E1EC"/>
+              <w:bottom w:val="single" w:sz="6" w:color="D8E1EC"/>
+              <w:end w:val="single" w:sz="6" w:color="D8E1EC"/>
+              <w:insideH w:val="single" w:sz="6" w:color="D8E1EC"/>
+              <w:insideV w:val="single" w:sz="6" w:color="D8E1EC"/>
+            </w:tcBorders>
+          </w:tcPr>
+          <w:p>
+            <w:pPr>
+              <w:spacing w:before="20" w:after="20" w:line="300" w:lineRule="auto"/>
+              <w:keepNext/>
+            </w:pPr>
+            <w:r>
+              <w:rPr>
+                <w:rFonts w:ascii="Calibri" w:hAnsi="Calibri" w:eastAsia="Microsoft YaHei"/>
+                <w:color w:val="1F2933"/>
+                <w:sz w:val="22"/>
+              </w:rPr>
+              <w:t>先看复杂反光环境下的激光定位。画面里最亮的地方未必是激光点，屏幕、高光和边缘反射都会制造伪点。系统先用靶框限定动态 ROI，再用 YCbCr 双通道、游程长度、种子和峰值计数筛选候选，最后提取可信的质心坐标。坐标送到 F407 做闭环控制，云台和激光才会跟着亮点走起来。</w:t>
+            </w:r>
+          </w:p>
+        </w:tc>
+      </w:tr>
+    </w:tbl>
+    <w:p>
+      <w:pPr>
+        <w:spacing w:after="40"/>
+      </w:pPr>
     </w:p>
     <w:p>
       <w:pPr>
-        <w:spacing w:line="300" w:lineRule="auto" w:after="100"/>
-        <w:ind w:firstLine="420"/>
+        <w:pStyle w:val="Heading1"/>
+        <w:keepNext/>
       </w:pPr>
       <w:r>
         <w:rPr>
-          <w:rFonts w:ascii="Microsoft YaHei" w:hAnsi="Microsoft YaHei" w:eastAsia="Microsoft YaHei"/>
-          <w:b w:val="0"/>
-          <w:sz w:val="21"/>
+          <w:rFonts w:ascii="Calibri" w:hAnsi="Calibri" w:eastAsia="Microsoft YaHei"/>
         </w:rPr>
-        <w:t>这一页是我们作品最想表达的特色：现实物体本身就可以成为 VR 的控制器。原型只需要摄像头、一个实体圆柱和一只彩色手套。实体圆柱的位置决定虚拟保龄球的初始位置，手的运动决定抓取方向和投掷速度。我们不仅识别“这里有一个物体”，还让它在虚拟空间中继续运动并产生碰撞。保龄球是直观的验证载体，背后的方法可以扩展到 VR 训练、数字孪生、沉浸式游戏和远程操作。</w:t>
+        <w:t>第 11 页  |  稳定性设计</w:t>
       </w:r>
+    </w:p>
+    <w:tbl>
+      <w:tblPr>
+        <w:tblStyle w:val="TableGrid"/>
+        <w:tblW w:type="dxa" w:w="9360"/>
+        <w:tblLayout w:type="fixed"/>
+        <w:tblLook w:firstColumn="1" w:firstRow="1" w:lastColumn="0" w:lastRow="0" w:noHBand="0" w:noVBand="1" w:val="04A0"/>
+        <w:tblInd w:w="120" w:type="dxa"/>
+      </w:tblPr>
+      <w:tblGrid>
+        <w:gridCol w:w="1320"/>
+        <w:gridCol w:w="8040"/>
+      </w:tblGrid>
+      <w:tr>
+        <w:tc>
+          <w:tcPr>
+            <w:tcW w:type="dxa" w:w="1320"/>
+            <w:tcMar>
+              <w:top w:w="100" w:type="dxa"/>
+              <w:start w:w="120" w:type="dxa"/>
+              <w:bottom w:w="100" w:type="dxa"/>
+              <w:end w:w="120" w:type="dxa"/>
+            </w:tcMar>
+            <w:shd w:fill="123C73"/>
+            <w:tcBorders>
+              <w:top w:val="single" w:sz="6" w:color="D8E1EC"/>
+              <w:start w:val="single" w:sz="6" w:color="D8E1EC"/>
+              <w:bottom w:val="single" w:sz="6" w:color="D8E1EC"/>
+              <w:end w:val="single" w:sz="6" w:color="D8E1EC"/>
+              <w:insideH w:val="single" w:sz="6" w:color="D8E1EC"/>
+              <w:insideV w:val="single" w:sz="6" w:color="D8E1EC"/>
+            </w:tcBorders>
+          </w:tcPr>
+          <w:p>
+            <w:pPr>
+              <w:spacing w:before="40" w:after="40" w:line="240" w:lineRule="auto"/>
+              <w:jc w:val="center"/>
+              <w:keepNext/>
+            </w:pPr>
+            <w:r>
+              <w:rPr>
+                <w:rFonts w:ascii="Calibri" w:hAnsi="Calibri" w:eastAsia="Microsoft YaHei"/>
+                <w:b/>
+                <w:color w:val="FFFFFF"/>
+                <w:sz w:val="20"/>
+              </w:rPr>
+              <w:t>35 秒</w:t>
+            </w:r>
+          </w:p>
+        </w:tc>
+        <w:tc>
+          <w:tcPr>
+            <w:tcW w:type="dxa" w:w="8040"/>
+            <w:tcMar>
+              <w:top w:w="100" w:type="dxa"/>
+              <w:start w:w="120" w:type="dxa"/>
+              <w:bottom w:w="100" w:type="dxa"/>
+              <w:end w:w="120" w:type="dxa"/>
+            </w:tcMar>
+            <w:shd w:fill="F4F7FA"/>
+            <w:tcBorders>
+              <w:top w:val="single" w:sz="6" w:color="D8E1EC"/>
+              <w:start w:val="single" w:sz="6" w:color="D8E1EC"/>
+              <w:bottom w:val="single" w:sz="6" w:color="D8E1EC"/>
+              <w:end w:val="single" w:sz="6" w:color="D8E1EC"/>
+              <w:insideH w:val="single" w:sz="6" w:color="D8E1EC"/>
+              <w:insideV w:val="single" w:sz="6" w:color="D8E1EC"/>
+            </w:tcBorders>
+          </w:tcPr>
+          <w:p>
+            <w:pPr>
+              <w:spacing w:before="20" w:after="20" w:line="300" w:lineRule="auto"/>
+              <w:keepNext/>
+            </w:pPr>
+            <w:r>
+              <w:rPr>
+                <w:rFonts w:ascii="Calibri" w:hAnsi="Calibri" w:eastAsia="Microsoft YaHei"/>
+                <w:color w:val="1F2933"/>
+                <w:sz w:val="22"/>
+              </w:rPr>
+              <w:t>云台追踪的难点是稳定。空间上，动态 ROI 先压掉屏幕和边缘高光；候选要满足 Y≥220、游程 6 到 96、种子至少 2 个、峰值至少 2 个；时间上用 3 帧确认、6 帧保持和 ±24 像素跟踪门；输出与检测按同一帧对齐，控制周期是 10 毫秒。这样直线和圆形轨迹都能连续跟下来。</w:t>
+            </w:r>
+          </w:p>
+        </w:tc>
+      </w:tr>
+    </w:tbl>
+    <w:p>
+      <w:pPr>
+        <w:spacing w:after="40"/>
+      </w:pPr>
     </w:p>
     <w:p>
       <w:pPr>
+        <w:pStyle w:val="Heading1"/>
         <w:keepNext/>
-        <w:spacing w:before="160" w:after="20"/>
       </w:pPr>
       <w:r>
         <w:rPr>
-          <w:rFonts w:ascii="Microsoft YaHei" w:hAnsi="Microsoft YaHei" w:eastAsia="Microsoft YaHei"/>
-          <w:b/>
-          <w:color w:val="103878"/>
-          <w:sz w:val="25"/>
+          <w:rFonts w:ascii="Calibri" w:hAnsi="Calibri" w:eastAsia="Microsoft YaHei"/>
         </w:rPr>
-        <w:t>05｜虚拟物品抓取演示</w:t>
+        <w:t>第 12 页  |  VR 保龄球</w:t>
       </w:r>
+    </w:p>
+    <w:tbl>
+      <w:tblPr>
+        <w:tblStyle w:val="TableGrid"/>
+        <w:tblW w:type="dxa" w:w="9360"/>
+        <w:tblLayout w:type="fixed"/>
+        <w:tblLook w:firstColumn="1" w:firstRow="1" w:lastColumn="0" w:lastRow="0" w:noHBand="0" w:noVBand="1" w:val="04A0"/>
+        <w:tblInd w:w="120" w:type="dxa"/>
+      </w:tblPr>
+      <w:tblGrid>
+        <w:gridCol w:w="1320"/>
+        <w:gridCol w:w="8040"/>
+      </w:tblGrid>
+      <w:tr>
+        <w:tc>
+          <w:tcPr>
+            <w:tcW w:type="dxa" w:w="1320"/>
+            <w:tcMar>
+              <w:top w:w="100" w:type="dxa"/>
+              <w:start w:w="120" w:type="dxa"/>
+              <w:bottom w:w="100" w:type="dxa"/>
+              <w:end w:w="120" w:type="dxa"/>
+            </w:tcMar>
+            <w:shd w:fill="123C73"/>
+            <w:tcBorders>
+              <w:top w:val="single" w:sz="6" w:color="D8E1EC"/>
+              <w:start w:val="single" w:sz="6" w:color="D8E1EC"/>
+              <w:bottom w:val="single" w:sz="6" w:color="D8E1EC"/>
+              <w:end w:val="single" w:sz="6" w:color="D8E1EC"/>
+              <w:insideH w:val="single" w:sz="6" w:color="D8E1EC"/>
+              <w:insideV w:val="single" w:sz="6" w:color="D8E1EC"/>
+            </w:tcBorders>
+          </w:tcPr>
+          <w:p>
+            <w:pPr>
+              <w:spacing w:before="40" w:after="40" w:line="240" w:lineRule="auto"/>
+              <w:jc w:val="center"/>
+              <w:keepNext/>
+            </w:pPr>
+            <w:r>
+              <w:rPr>
+                <w:rFonts w:ascii="Calibri" w:hAnsi="Calibri" w:eastAsia="Microsoft YaHei"/>
+                <w:b/>
+                <w:color w:val="FFFFFF"/>
+                <w:sz w:val="20"/>
+              </w:rPr>
+              <w:t>35 秒</w:t>
+            </w:r>
+          </w:p>
+        </w:tc>
+        <w:tc>
+          <w:tcPr>
+            <w:tcW w:type="dxa" w:w="8040"/>
+            <w:tcMar>
+              <w:top w:w="100" w:type="dxa"/>
+              <w:start w:w="120" w:type="dxa"/>
+              <w:bottom w:w="100" w:type="dxa"/>
+              <w:end w:w="120" w:type="dxa"/>
+            </w:tcMar>
+            <w:shd w:fill="F4F7FA"/>
+            <w:tcBorders>
+              <w:top w:val="single" w:sz="6" w:color="D8E1EC"/>
+              <w:start w:val="single" w:sz="6" w:color="D8E1EC"/>
+              <w:bottom w:val="single" w:sz="6" w:color="D8E1EC"/>
+              <w:end w:val="single" w:sz="6" w:color="D8E1EC"/>
+              <w:insideH w:val="single" w:sz="6" w:color="D8E1EC"/>
+              <w:insideV w:val="single" w:sz="6" w:color="D8E1EC"/>
+            </w:tcBorders>
+          </w:tcPr>
+          <w:p>
+            <w:pPr>
+              <w:spacing w:before="20" w:after="20" w:line="300" w:lineRule="auto"/>
+              <w:keepNext/>
+            </w:pPr>
+            <w:r>
+              <w:rPr>
+                <w:rFonts w:ascii="Calibri" w:hAnsi="Calibri" w:eastAsia="Microsoft YaHei"/>
+                <w:color w:val="1F2933"/>
+                <w:sz w:val="22"/>
+              </w:rPr>
+              <w:t>云台追踪解决一个点，VR 保龄球要把现实动作完整带进虚拟空间。摄像头识别实体圆柱，初始化虚拟球的位置；蓝色手势进入范围后，球与手绑定并持续跟随；手越过发球线松开，系统记录释放速度和方向，虚拟球随后进入碰撞计算。现实物体和手势，在这里直接成为 VR 控制器。</w:t>
+            </w:r>
+          </w:p>
+        </w:tc>
+      </w:tr>
+    </w:tbl>
+    <w:p>
+      <w:pPr>
+        <w:spacing w:after="40"/>
+      </w:pPr>
     </w:p>
     <w:p>
       <w:pPr>
+        <w:pStyle w:val="Heading1"/>
         <w:keepNext/>
-        <w:spacing w:after="40"/>
       </w:pPr>
       <w:r>
         <w:rPr>
-          <w:rFonts w:ascii="Microsoft YaHei" w:hAnsi="Microsoft YaHei" w:eastAsia="Microsoft YaHei"/>
-          <w:b/>
-          <w:color w:val="323232"/>
-          <w:sz w:val="21"/>
+          <w:rFonts w:ascii="Calibri" w:hAnsi="Calibri" w:eastAsia="Microsoft YaHei"/>
         </w:rPr>
-        <w:t>从准备、抓取到释放，完成一次虚实交互</w:t>
+        <w:t>第 13 页  |  投掷闭环</w:t>
       </w:r>
+    </w:p>
+    <w:tbl>
+      <w:tblPr>
+        <w:tblStyle w:val="TableGrid"/>
+        <w:tblW w:type="dxa" w:w="9360"/>
+        <w:tblLayout w:type="fixed"/>
+        <w:tblLook w:firstColumn="1" w:firstRow="1" w:lastColumn="0" w:lastRow="0" w:noHBand="0" w:noVBand="1" w:val="04A0"/>
+        <w:tblInd w:w="120" w:type="dxa"/>
+      </w:tblPr>
+      <w:tblGrid>
+        <w:gridCol w:w="1320"/>
+        <w:gridCol w:w="8040"/>
+      </w:tblGrid>
+      <w:tr>
+        <w:tc>
+          <w:tcPr>
+            <w:tcW w:type="dxa" w:w="1320"/>
+            <w:tcMar>
+              <w:top w:w="100" w:type="dxa"/>
+              <w:start w:w="120" w:type="dxa"/>
+              <w:bottom w:w="100" w:type="dxa"/>
+              <w:end w:w="120" w:type="dxa"/>
+            </w:tcMar>
+            <w:shd w:fill="123C73"/>
+            <w:tcBorders>
+              <w:top w:val="single" w:sz="6" w:color="D8E1EC"/>
+              <w:start w:val="single" w:sz="6" w:color="D8E1EC"/>
+              <w:bottom w:val="single" w:sz="6" w:color="D8E1EC"/>
+              <w:end w:val="single" w:sz="6" w:color="D8E1EC"/>
+              <w:insideH w:val="single" w:sz="6" w:color="D8E1EC"/>
+              <w:insideV w:val="single" w:sz="6" w:color="D8E1EC"/>
+            </w:tcBorders>
+          </w:tcPr>
+          <w:p>
+            <w:pPr>
+              <w:spacing w:before="40" w:after="40" w:line="240" w:lineRule="auto"/>
+              <w:jc w:val="center"/>
+              <w:keepNext/>
+            </w:pPr>
+            <w:r>
+              <w:rPr>
+                <w:rFonts w:ascii="Calibri" w:hAnsi="Calibri" w:eastAsia="Microsoft YaHei"/>
+                <w:b/>
+                <w:color w:val="FFFFFF"/>
+                <w:sz w:val="20"/>
+              </w:rPr>
+              <w:t>35 秒</w:t>
+            </w:r>
+          </w:p>
+        </w:tc>
+        <w:tc>
+          <w:tcPr>
+            <w:tcW w:type="dxa" w:w="8040"/>
+            <w:tcMar>
+              <w:top w:w="100" w:type="dxa"/>
+              <w:start w:w="120" w:type="dxa"/>
+              <w:bottom w:w="100" w:type="dxa"/>
+              <w:end w:w="120" w:type="dxa"/>
+            </w:tcMar>
+            <w:shd w:fill="F4F7FA"/>
+            <w:tcBorders>
+              <w:top w:val="single" w:sz="6" w:color="D8E1EC"/>
+              <w:start w:val="single" w:sz="6" w:color="D8E1EC"/>
+              <w:bottom w:val="single" w:sz="6" w:color="D8E1EC"/>
+              <w:end w:val="single" w:sz="6" w:color="D8E1EC"/>
+              <w:insideH w:val="single" w:sz="6" w:color="D8E1EC"/>
+              <w:insideV w:val="single" w:sz="6" w:color="D8E1EC"/>
+            </w:tcBorders>
+          </w:tcPr>
+          <w:p>
+            <w:pPr>
+              <w:spacing w:before="20" w:after="20" w:line="300" w:lineRule="auto"/>
+              <w:keepNext/>
+            </w:pPr>
+            <w:r>
+              <w:rPr>
+                <w:rFonts w:ascii="Calibri" w:hAnsi="Calibri" w:eastAsia="Microsoft YaHei"/>
+                <w:color w:val="1F2933"/>
+                <w:sz w:val="22"/>
+              </w:rPr>
+              <w:t>这套交互有五个连续阶段：空间标定、坐标映射、持续抓取、越线释放、物理反馈。FPGA 从像素流中提取地图边界、目标中心和手势中心，上位机完成二维到三维映射、时域去抖、抓取状态机和碰撞计算，再把虚拟球的位置发回 FPGA 叠加到 HDMI。短时检测波动不会让球在半路突然掉下来。</w:t>
+            </w:r>
+          </w:p>
+        </w:tc>
+      </w:tr>
+    </w:tbl>
+    <w:p>
+      <w:pPr>
+        <w:spacing w:after="40"/>
+      </w:pPr>
     </w:p>
     <w:p>
       <w:pPr>
-        <w:spacing w:line="300" w:lineRule="auto" w:after="100"/>
-        <w:ind w:firstLine="420"/>
+        <w:pStyle w:val="Heading1"/>
+        <w:keepNext/>
       </w:pPr>
       <w:r>
         <w:rPr>
-          <w:rFonts w:ascii="Microsoft YaHei" w:hAnsi="Microsoft YaHei" w:eastAsia="Microsoft YaHei"/>
-          <w:b w:val="0"/>
-          <w:sz w:val="21"/>
+          <w:rFonts w:ascii="Calibri" w:hAnsi="Calibri" w:eastAsia="Microsoft YaHei"/>
         </w:rPr>
-        <w:t>接下来请各位老师看屏幕，我们用四个阶段完成一次虚实交互。第一步是准备：FPGA 检测红色实体圆柱，上位机依据它在交互区中的坐标，初始化三维空间里的保龄球。第二步是抓取：蓝色手势进入虚拟球的抓取范围后，虚拟球与手绑定。这里加入电脑侧时域去抖和短时丢失保持，偶尔一帧没有检测到蓝色，也不会让球突然脱手。</w:t>
+        <w:t>第 14 页  |  孙悟空纸偶</w:t>
       </w:r>
+    </w:p>
+    <w:tbl>
+      <w:tblPr>
+        <w:tblStyle w:val="TableGrid"/>
+        <w:tblW w:type="dxa" w:w="9360"/>
+        <w:tblLayout w:type="fixed"/>
+        <w:tblLook w:firstColumn="1" w:firstRow="1" w:lastColumn="0" w:lastRow="0" w:noHBand="0" w:noVBand="1" w:val="04A0"/>
+        <w:tblInd w:w="120" w:type="dxa"/>
+      </w:tblPr>
+      <w:tblGrid>
+        <w:gridCol w:w="1320"/>
+        <w:gridCol w:w="8040"/>
+      </w:tblGrid>
+      <w:tr>
+        <w:tc>
+          <w:tcPr>
+            <w:tcW w:type="dxa" w:w="1320"/>
+            <w:tcMar>
+              <w:top w:w="100" w:type="dxa"/>
+              <w:start w:w="120" w:type="dxa"/>
+              <w:bottom w:w="100" w:type="dxa"/>
+              <w:end w:w="120" w:type="dxa"/>
+            </w:tcMar>
+            <w:shd w:fill="123C73"/>
+            <w:tcBorders>
+              <w:top w:val="single" w:sz="6" w:color="D8E1EC"/>
+              <w:start w:val="single" w:sz="6" w:color="D8E1EC"/>
+              <w:bottom w:val="single" w:sz="6" w:color="D8E1EC"/>
+              <w:end w:val="single" w:sz="6" w:color="D8E1EC"/>
+              <w:insideH w:val="single" w:sz="6" w:color="D8E1EC"/>
+              <w:insideV w:val="single" w:sz="6" w:color="D8E1EC"/>
+            </w:tcBorders>
+          </w:tcPr>
+          <w:p>
+            <w:pPr>
+              <w:spacing w:before="40" w:after="40" w:line="240" w:lineRule="auto"/>
+              <w:jc w:val="center"/>
+              <w:keepNext/>
+            </w:pPr>
+            <w:r>
+              <w:rPr>
+                <w:rFonts w:ascii="Calibri" w:hAnsi="Calibri" w:eastAsia="Microsoft YaHei"/>
+                <w:b/>
+                <w:color w:val="FFFFFF"/>
+                <w:sz w:val="20"/>
+              </w:rPr>
+              <w:t>30 秒</w:t>
+            </w:r>
+          </w:p>
+        </w:tc>
+        <w:tc>
+          <w:tcPr>
+            <w:tcW w:type="dxa" w:w="8040"/>
+            <w:tcMar>
+              <w:top w:w="100" w:type="dxa"/>
+              <w:start w:w="120" w:type="dxa"/>
+              <w:bottom w:w="100" w:type="dxa"/>
+              <w:end w:w="120" w:type="dxa"/>
+            </w:tcMar>
+            <w:shd w:fill="F4F7FA"/>
+            <w:tcBorders>
+              <w:top w:val="single" w:sz="6" w:color="D8E1EC"/>
+              <w:start w:val="single" w:sz="6" w:color="D8E1EC"/>
+              <w:bottom w:val="single" w:sz="6" w:color="D8E1EC"/>
+              <w:end w:val="single" w:sz="6" w:color="D8E1EC"/>
+              <w:insideH w:val="single" w:sz="6" w:color="D8E1EC"/>
+              <w:insideV w:val="single" w:sz="6" w:color="D8E1EC"/>
+            </w:tcBorders>
+          </w:tcPr>
+          <w:p>
+            <w:pPr>
+              <w:spacing w:before="20" w:after="20" w:line="300" w:lineRule="auto"/>
+              <w:keepNext/>
+            </w:pPr>
+            <w:r>
+              <w:rPr>
+                <w:rFonts w:ascii="Calibri" w:hAnsi="Calibri" w:eastAsia="Microsoft YaHei"/>
+                <w:color w:val="1F2933"/>
+                <w:sz w:val="22"/>
+              </w:rPr>
+              <w:t>第三个演示把识别结果变成角色动作。纸偶旁边的蓝色实体标志物提供位置和状态：它移动到哪里，角色就往哪里走；状态发生变化，孙悟空就切换待机、跳跃或挥棒。FPGA 选出对应动作帧，直接叠加到 HDMI 画面。坐标经过状态判断以后，才变成观众能马上读懂的动作。</w:t>
+            </w:r>
+          </w:p>
+        </w:tc>
+      </w:tr>
+    </w:tbl>
+    <w:p>
+      <w:pPr>
+        <w:spacing w:after="40"/>
+      </w:pPr>
     </w:p>
     <w:p>
       <w:pPr>
+        <w:pStyle w:val="Heading1"/>
         <w:keepNext/>
-        <w:spacing w:before="160" w:after="20"/>
       </w:pPr>
       <w:r>
         <w:rPr>
-          <w:rFonts w:ascii="Microsoft YaHei" w:hAnsi="Microsoft YaHei" w:eastAsia="Microsoft YaHei"/>
-          <w:b/>
-          <w:color w:val="103878"/>
-          <w:sz w:val="25"/>
+          <w:rFonts w:ascii="Calibri" w:hAnsi="Calibri" w:eastAsia="Microsoft YaHei"/>
         </w:rPr>
-        <w:t>06｜越线释放与碰撞反馈</w:t>
+        <w:t>第 15 页  |  动作驱动</w:t>
       </w:r>
+    </w:p>
+    <w:tbl>
+      <w:tblPr>
+        <w:tblStyle w:val="TableGrid"/>
+        <w:tblW w:type="dxa" w:w="9360"/>
+        <w:tblLayout w:type="fixed"/>
+        <w:tblLook w:firstColumn="1" w:firstRow="1" w:lastColumn="0" w:lastRow="0" w:noHBand="0" w:noVBand="1" w:val="04A0"/>
+        <w:tblInd w:w="120" w:type="dxa"/>
+      </w:tblPr>
+      <w:tblGrid>
+        <w:gridCol w:w="1320"/>
+        <w:gridCol w:w="8040"/>
+      </w:tblGrid>
+      <w:tr>
+        <w:tc>
+          <w:tcPr>
+            <w:tcW w:type="dxa" w:w="1320"/>
+            <w:tcMar>
+              <w:top w:w="100" w:type="dxa"/>
+              <w:start w:w="120" w:type="dxa"/>
+              <w:bottom w:w="100" w:type="dxa"/>
+              <w:end w:w="120" w:type="dxa"/>
+            </w:tcMar>
+            <w:shd w:fill="123C73"/>
+            <w:tcBorders>
+              <w:top w:val="single" w:sz="6" w:color="D8E1EC"/>
+              <w:start w:val="single" w:sz="6" w:color="D8E1EC"/>
+              <w:bottom w:val="single" w:sz="6" w:color="D8E1EC"/>
+              <w:end w:val="single" w:sz="6" w:color="D8E1EC"/>
+              <w:insideH w:val="single" w:sz="6" w:color="D8E1EC"/>
+              <w:insideV w:val="single" w:sz="6" w:color="D8E1EC"/>
+            </w:tcBorders>
+          </w:tcPr>
+          <w:p>
+            <w:pPr>
+              <w:spacing w:before="40" w:after="40" w:line="240" w:lineRule="auto"/>
+              <w:jc w:val="center"/>
+              <w:keepNext/>
+            </w:pPr>
+            <w:r>
+              <w:rPr>
+                <w:rFonts w:ascii="Calibri" w:hAnsi="Calibri" w:eastAsia="Microsoft YaHei"/>
+                <w:b/>
+                <w:color w:val="FFFFFF"/>
+                <w:sz w:val="20"/>
+              </w:rPr>
+              <w:t>25 秒</w:t>
+            </w:r>
+          </w:p>
+        </w:tc>
+        <w:tc>
+          <w:tcPr>
+            <w:tcW w:type="dxa" w:w="8040"/>
+            <w:tcMar>
+              <w:top w:w="100" w:type="dxa"/>
+              <w:start w:w="120" w:type="dxa"/>
+              <w:bottom w:w="100" w:type="dxa"/>
+              <w:end w:w="120" w:type="dxa"/>
+            </w:tcMar>
+            <w:shd w:fill="F4F7FA"/>
+            <w:tcBorders>
+              <w:top w:val="single" w:sz="6" w:color="D8E1EC"/>
+              <w:start w:val="single" w:sz="6" w:color="D8E1EC"/>
+              <w:bottom w:val="single" w:sz="6" w:color="D8E1EC"/>
+              <w:end w:val="single" w:sz="6" w:color="D8E1EC"/>
+              <w:insideH w:val="single" w:sz="6" w:color="D8E1EC"/>
+              <w:insideV w:val="single" w:sz="6" w:color="D8E1EC"/>
+            </w:tcBorders>
+          </w:tcPr>
+          <w:p>
+            <w:pPr>
+              <w:spacing w:before="20" w:after="20" w:line="300" w:lineRule="auto"/>
+              <w:keepNext/>
+            </w:pPr>
+            <w:r>
+              <w:rPr>
+                <w:rFonts w:ascii="Calibri" w:hAnsi="Calibri" w:eastAsia="Microsoft YaHei"/>
+                <w:color w:val="1F2933"/>
+                <w:sz w:val="22"/>
+              </w:rPr>
+              <w:t>动作图集写入片上 M4K，蓝色区域持续提供位置，状态在帧边界锁存，再选择对应动作帧。整条路径只有四步：识别、状态判断、动作帧选择、HDMI 叠加。左侧的动作图集和右侧的实体标志物，在硬件接口里被直接接起来，结果可以逐帧显示。</w:t>
+            </w:r>
+          </w:p>
+        </w:tc>
+      </w:tr>
+    </w:tbl>
+    <w:p>
+      <w:pPr>
+        <w:spacing w:after="40"/>
+      </w:pPr>
     </w:p>
     <w:p>
       <w:pPr>
+        <w:pStyle w:val="Heading1"/>
         <w:keepNext/>
-        <w:spacing w:after="40"/>
       </w:pPr>
       <w:r>
         <w:rPr>
-          <w:rFonts w:ascii="Microsoft YaHei" w:hAnsi="Microsoft YaHei" w:eastAsia="Microsoft YaHei"/>
-          <w:b/>
-          <w:color w:val="323232"/>
-          <w:sz w:val="21"/>
+          <w:rFonts w:ascii="Calibri" w:hAnsi="Calibri" w:eastAsia="Microsoft YaHei"/>
         </w:rPr>
-        <w:t>越过发球线后释放，并继承真实动作速度</w:t>
+        <w:t>第 16 页  |  工程验证</w:t>
       </w:r>
+    </w:p>
+    <w:tbl>
+      <w:tblPr>
+        <w:tblStyle w:val="TableGrid"/>
+        <w:tblW w:type="dxa" w:w="9360"/>
+        <w:tblLayout w:type="fixed"/>
+        <w:tblLook w:firstColumn="1" w:firstRow="1" w:lastColumn="0" w:lastRow="0" w:noHBand="0" w:noVBand="1" w:val="04A0"/>
+        <w:tblInd w:w="120" w:type="dxa"/>
+      </w:tblPr>
+      <w:tblGrid>
+        <w:gridCol w:w="1320"/>
+        <w:gridCol w:w="8040"/>
+      </w:tblGrid>
+      <w:tr>
+        <w:tc>
+          <w:tcPr>
+            <w:tcW w:type="dxa" w:w="1320"/>
+            <w:tcMar>
+              <w:top w:w="100" w:type="dxa"/>
+              <w:start w:w="120" w:type="dxa"/>
+              <w:bottom w:w="100" w:type="dxa"/>
+              <w:end w:w="120" w:type="dxa"/>
+            </w:tcMar>
+            <w:shd w:fill="123C73"/>
+            <w:tcBorders>
+              <w:top w:val="single" w:sz="6" w:color="D8E1EC"/>
+              <w:start w:val="single" w:sz="6" w:color="D8E1EC"/>
+              <w:bottom w:val="single" w:sz="6" w:color="D8E1EC"/>
+              <w:end w:val="single" w:sz="6" w:color="D8E1EC"/>
+              <w:insideH w:val="single" w:sz="6" w:color="D8E1EC"/>
+              <w:insideV w:val="single" w:sz="6" w:color="D8E1EC"/>
+            </w:tcBorders>
+          </w:tcPr>
+          <w:p>
+            <w:pPr>
+              <w:spacing w:before="40" w:after="40" w:line="240" w:lineRule="auto"/>
+              <w:jc w:val="center"/>
+              <w:keepNext/>
+            </w:pPr>
+            <w:r>
+              <w:rPr>
+                <w:rFonts w:ascii="Calibri" w:hAnsi="Calibri" w:eastAsia="Microsoft YaHei"/>
+                <w:b/>
+                <w:color w:val="FFFFFF"/>
+                <w:sz w:val="20"/>
+              </w:rPr>
+              <w:t>30 秒</w:t>
+            </w:r>
+          </w:p>
+        </w:tc>
+        <w:tc>
+          <w:tcPr>
+            <w:tcW w:type="dxa" w:w="8040"/>
+            <w:tcMar>
+              <w:top w:w="100" w:type="dxa"/>
+              <w:start w:w="120" w:type="dxa"/>
+              <w:bottom w:w="100" w:type="dxa"/>
+              <w:end w:w="120" w:type="dxa"/>
+            </w:tcMar>
+            <w:shd w:fill="F4F7FA"/>
+            <w:tcBorders>
+              <w:top w:val="single" w:sz="6" w:color="D8E1EC"/>
+              <w:start w:val="single" w:sz="6" w:color="D8E1EC"/>
+              <w:bottom w:val="single" w:sz="6" w:color="D8E1EC"/>
+              <w:end w:val="single" w:sz="6" w:color="D8E1EC"/>
+              <w:insideH w:val="single" w:sz="6" w:color="D8E1EC"/>
+              <w:insideV w:val="single" w:sz="6" w:color="D8E1EC"/>
+            </w:tcBorders>
+          </w:tcPr>
+          <w:p>
+            <w:pPr>
+              <w:spacing w:before="20" w:after="20" w:line="300" w:lineRule="auto"/>
+              <w:keepNext/>
+            </w:pPr>
+            <w:r>
+              <w:rPr>
+                <w:rFonts w:ascii="Calibri" w:hAnsi="Calibri" w:eastAsia="Microsoft YaHei"/>
+                <w:color w:val="1F2933"/>
+                <w:sz w:val="22"/>
+              </w:rPr>
+              <w:t>工程状态按验证边界说明。孙悟空部分已经写入 12 帧动作图集，覆盖待机、移动、跳跃、准备、挥棒和恢复；工程构建和 RTL 仿真已经通过。最终板卡联调还没有完成，因此页面上保留 BUILT_NOT_BOARD_VERIFIED 标记。仿真结果和板卡实测分别到哪里，汇报就说到哪里。</w:t>
+            </w:r>
+          </w:p>
+        </w:tc>
+      </w:tr>
+    </w:tbl>
+    <w:p>
+      <w:pPr>
+        <w:spacing w:after="40"/>
+      </w:pPr>
     </w:p>
     <w:p>
       <w:pPr>
-        <w:spacing w:line="300" w:lineRule="auto" w:after="100"/>
-        <w:ind w:firstLine="420"/>
+        <w:pStyle w:val="Heading1"/>
+        <w:keepNext/>
       </w:pPr>
       <w:r>
         <w:rPr>
-          <w:rFonts w:ascii="Microsoft YaHei" w:hAnsi="Microsoft YaHei" w:eastAsia="Microsoft YaHei"/>
-          <w:b w:val="0"/>
-          <w:sz w:val="21"/>
+          <w:rFonts w:ascii="Calibri" w:hAnsi="Calibri" w:eastAsia="Microsoft YaHei"/>
         </w:rPr>
-        <w:t>第三步是越线释放：球越过发球线的一瞬间，系统记录手在最近一段时间内的位移，计算释放速度和方向，移动得越快，虚拟球的初速度越大。第四步是碰撞反馈：球脱离手势后由三维物理逻辑继续运动，撞击具有高度和惯性的球瓶。同时，上位机把虚拟球对应的二维像素坐标发回 FPGA，HDMI 画面中的圆环同步反馈虚拟球位置，形成现实输入、虚拟运动、屏幕反馈的完整闭环。</w:t>
+        <w:t>第 17 页  |  系统架构</w:t>
       </w:r>
+    </w:p>
+    <w:tbl>
+      <w:tblPr>
+        <w:tblStyle w:val="TableGrid"/>
+        <w:tblW w:type="dxa" w:w="9360"/>
+        <w:tblLayout w:type="fixed"/>
+        <w:tblLook w:firstColumn="1" w:firstRow="1" w:lastColumn="0" w:lastRow="0" w:noHBand="0" w:noVBand="1" w:val="04A0"/>
+        <w:tblInd w:w="120" w:type="dxa"/>
+      </w:tblPr>
+      <w:tblGrid>
+        <w:gridCol w:w="1320"/>
+        <w:gridCol w:w="8040"/>
+      </w:tblGrid>
+      <w:tr>
+        <w:tc>
+          <w:tcPr>
+            <w:tcW w:type="dxa" w:w="1320"/>
+            <w:tcMar>
+              <w:top w:w="100" w:type="dxa"/>
+              <w:start w:w="120" w:type="dxa"/>
+              <w:bottom w:w="100" w:type="dxa"/>
+              <w:end w:w="120" w:type="dxa"/>
+            </w:tcMar>
+            <w:shd w:fill="123C73"/>
+            <w:tcBorders>
+              <w:top w:val="single" w:sz="6" w:color="D8E1EC"/>
+              <w:start w:val="single" w:sz="6" w:color="D8E1EC"/>
+              <w:bottom w:val="single" w:sz="6" w:color="D8E1EC"/>
+              <w:end w:val="single" w:sz="6" w:color="D8E1EC"/>
+              <w:insideH w:val="single" w:sz="6" w:color="D8E1EC"/>
+              <w:insideV w:val="single" w:sz="6" w:color="D8E1EC"/>
+            </w:tcBorders>
+          </w:tcPr>
+          <w:p>
+            <w:pPr>
+              <w:spacing w:before="40" w:after="40" w:line="240" w:lineRule="auto"/>
+              <w:jc w:val="center"/>
+              <w:keepNext/>
+            </w:pPr>
+            <w:r>
+              <w:rPr>
+                <w:rFonts w:ascii="Calibri" w:hAnsi="Calibri" w:eastAsia="Microsoft YaHei"/>
+                <w:b/>
+                <w:color w:val="FFFFFF"/>
+                <w:sz w:val="20"/>
+              </w:rPr>
+              <w:t>30 秒</w:t>
+            </w:r>
+          </w:p>
+        </w:tc>
+        <w:tc>
+          <w:tcPr>
+            <w:tcW w:type="dxa" w:w="8040"/>
+            <w:tcMar>
+              <w:top w:w="100" w:type="dxa"/>
+              <w:start w:w="120" w:type="dxa"/>
+              <w:bottom w:w="100" w:type="dxa"/>
+              <w:end w:w="120" w:type="dxa"/>
+            </w:tcMar>
+            <w:shd w:fill="F4F7FA"/>
+            <w:tcBorders>
+              <w:top w:val="single" w:sz="6" w:color="D8E1EC"/>
+              <w:start w:val="single" w:sz="6" w:color="D8E1EC"/>
+              <w:bottom w:val="single" w:sz="6" w:color="D8E1EC"/>
+              <w:end w:val="single" w:sz="6" w:color="D8E1EC"/>
+              <w:insideH w:val="single" w:sz="6" w:color="D8E1EC"/>
+              <w:insideV w:val="single" w:sz="6" w:color="D8E1EC"/>
+            </w:tcBorders>
+          </w:tcPr>
+          <w:p>
+            <w:pPr>
+              <w:spacing w:before="20" w:after="20" w:line="300" w:lineRule="auto"/>
+              <w:keepNext/>
+            </w:pPr>
+            <w:r>
+              <w:rPr>
+                <w:rFonts w:ascii="Calibri" w:hAnsi="Calibri" w:eastAsia="Microsoft YaHei"/>
+                <w:color w:val="1F2933"/>
+                <w:sz w:val="22"/>
+              </w:rPr>
+              <w:t>把三个场景放回一张图里，分叉发生在输出端：云台接收亮点坐标，驱动真实执行机构；保龄球接收坐标和状态，进入二维到三维映射与物理计算；孙悟空接收状态，选择角色动画。前面的采集、处理、坐标、状态和 HDMI 都来自同一个底座。</w:t>
+            </w:r>
+          </w:p>
+        </w:tc>
+      </w:tr>
+    </w:tbl>
+    <w:p>
+      <w:pPr>
+        <w:spacing w:after="40"/>
+      </w:pPr>
     </w:p>
     <w:p>
       <w:pPr>
+        <w:pStyle w:val="Heading1"/>
         <w:keepNext/>
-        <w:spacing w:before="160" w:after="20"/>
       </w:pPr>
       <w:r>
         <w:rPr>
-          <w:rFonts w:ascii="Microsoft YaHei" w:hAnsi="Microsoft YaHei" w:eastAsia="Microsoft YaHei"/>
-          <w:b/>
-          <w:color w:val="103878"/>
-          <w:sz w:val="25"/>
+          <w:rFonts w:ascii="Calibri" w:hAnsi="Calibri" w:eastAsia="Microsoft YaHei"/>
         </w:rPr>
-        <w:t>07｜FPGA 理解交互拓扑</w:t>
+        <w:t>第 18 页  |  结果核验</w:t>
       </w:r>
+    </w:p>
+    <w:tbl>
+      <w:tblPr>
+        <w:tblStyle w:val="TableGrid"/>
+        <w:tblW w:type="dxa" w:w="9360"/>
+        <w:tblLayout w:type="fixed"/>
+        <w:tblLook w:firstColumn="1" w:firstRow="1" w:lastColumn="0" w:lastRow="0" w:noHBand="0" w:noVBand="1" w:val="04A0"/>
+        <w:tblInd w:w="120" w:type="dxa"/>
+      </w:tblPr>
+      <w:tblGrid>
+        <w:gridCol w:w="1320"/>
+        <w:gridCol w:w="8040"/>
+      </w:tblGrid>
+      <w:tr>
+        <w:tc>
+          <w:tcPr>
+            <w:tcW w:type="dxa" w:w="1320"/>
+            <w:tcMar>
+              <w:top w:w="100" w:type="dxa"/>
+              <w:start w:w="120" w:type="dxa"/>
+              <w:bottom w:w="100" w:type="dxa"/>
+              <w:end w:w="120" w:type="dxa"/>
+            </w:tcMar>
+            <w:shd w:fill="123C73"/>
+            <w:tcBorders>
+              <w:top w:val="single" w:sz="6" w:color="D8E1EC"/>
+              <w:start w:val="single" w:sz="6" w:color="D8E1EC"/>
+              <w:bottom w:val="single" w:sz="6" w:color="D8E1EC"/>
+              <w:end w:val="single" w:sz="6" w:color="D8E1EC"/>
+              <w:insideH w:val="single" w:sz="6" w:color="D8E1EC"/>
+              <w:insideV w:val="single" w:sz="6" w:color="D8E1EC"/>
+            </w:tcBorders>
+          </w:tcPr>
+          <w:p>
+            <w:pPr>
+              <w:spacing w:before="40" w:after="40" w:line="240" w:lineRule="auto"/>
+              <w:jc w:val="center"/>
+              <w:keepNext/>
+            </w:pPr>
+            <w:r>
+              <w:rPr>
+                <w:rFonts w:ascii="Calibri" w:hAnsi="Calibri" w:eastAsia="Microsoft YaHei"/>
+                <w:b/>
+                <w:color w:val="FFFFFF"/>
+                <w:sz w:val="20"/>
+              </w:rPr>
+              <w:t>30 秒</w:t>
+            </w:r>
+          </w:p>
+        </w:tc>
+        <w:tc>
+          <w:tcPr>
+            <w:tcW w:type="dxa" w:w="8040"/>
+            <w:tcMar>
+              <w:top w:w="100" w:type="dxa"/>
+              <w:start w:w="120" w:type="dxa"/>
+              <w:bottom w:w="100" w:type="dxa"/>
+              <w:end w:w="120" w:type="dxa"/>
+            </w:tcMar>
+            <w:shd w:fill="F4F7FA"/>
+            <w:tcBorders>
+              <w:top w:val="single" w:sz="6" w:color="D8E1EC"/>
+              <w:start w:val="single" w:sz="6" w:color="D8E1EC"/>
+              <w:bottom w:val="single" w:sz="6" w:color="D8E1EC"/>
+              <w:end w:val="single" w:sz="6" w:color="D8E1EC"/>
+              <w:insideH w:val="single" w:sz="6" w:color="D8E1EC"/>
+              <w:insideV w:val="single" w:sz="6" w:color="D8E1EC"/>
+            </w:tcBorders>
+          </w:tcPr>
+          <w:p>
+            <w:pPr>
+              <w:spacing w:before="20" w:after="20" w:line="300" w:lineRule="auto"/>
+              <w:keepNext/>
+            </w:pPr>
+            <w:r>
+              <w:rPr>
+                <w:rFonts w:ascii="Calibri" w:hAnsi="Calibri" w:eastAsia="Microsoft YaHei"/>
+                <w:color w:val="1F2933"/>
+                <w:sz w:val="22"/>
+              </w:rPr>
+              <w:t>最后把赛题指标逐项对上。视频链路是 OV5640 到 FPGA 再到 HDMI，分辨率 1280×720；上位机协议测试 22/22 通过；逻辑单元占用 22%，DSP 占用 4%，片上存储 1.93 Mbit。孙悟空工程完成构建和 RTL 仿真，板卡状态仍标注为 BUILT_NOT_BOARD_VERIFIED。每个数字，都对应前面的链路、算法或演示。</w:t>
+            </w:r>
+          </w:p>
+        </w:tc>
+      </w:tr>
+    </w:tbl>
+    <w:p>
+      <w:pPr>
+        <w:spacing w:after="40"/>
+      </w:pPr>
     </w:p>
     <w:p>
       <w:pPr>
+        <w:pStyle w:val="Heading1"/>
         <w:keepNext/>
-        <w:spacing w:after="40"/>
       </w:pPr>
       <w:r>
         <w:rPr>
-          <w:rFonts w:ascii="Microsoft YaHei" w:hAnsi="Microsoft YaHei" w:eastAsia="Microsoft YaHei"/>
-          <w:b/>
-          <w:color w:val="323232"/>
-          <w:sz w:val="21"/>
+          <w:rFonts w:ascii="Calibri" w:hAnsi="Calibri" w:eastAsia="Microsoft YaHei"/>
         </w:rPr>
-        <w:t>先确定交互空间，再提取目标和手势</w:t>
+        <w:t>第 19 页  |  总结</w:t>
       </w:r>
     </w:p>
+    <w:tbl>
+      <w:tblPr>
+        <w:tblStyle w:val="TableGrid"/>
+        <w:tblW w:type="dxa" w:w="9360"/>
+        <w:tblLayout w:type="fixed"/>
+        <w:tblLook w:firstColumn="1" w:firstRow="1" w:lastColumn="0" w:lastRow="0" w:noHBand="0" w:noVBand="1" w:val="04A0"/>
+        <w:tblInd w:w="120" w:type="dxa"/>
+      </w:tblPr>
+      <w:tblGrid>
+        <w:gridCol w:w="1320"/>
+        <w:gridCol w:w="8040"/>
+      </w:tblGrid>
+      <w:tr>
+        <w:tc>
+          <w:tcPr>
+            <w:tcW w:type="dxa" w:w="1320"/>
+            <w:tcMar>
+              <w:top w:w="100" w:type="dxa"/>
+              <w:start w:w="120" w:type="dxa"/>
+              <w:bottom w:w="100" w:type="dxa"/>
+              <w:end w:w="120" w:type="dxa"/>
+            </w:tcMar>
+            <w:shd w:fill="123C73"/>
+            <w:tcBorders>
+              <w:top w:val="single" w:sz="6" w:color="D8E1EC"/>
+              <w:start w:val="single" w:sz="6" w:color="D8E1EC"/>
+              <w:bottom w:val="single" w:sz="6" w:color="D8E1EC"/>
+              <w:end w:val="single" w:sz="6" w:color="D8E1EC"/>
+              <w:insideH w:val="single" w:sz="6" w:color="D8E1EC"/>
+              <w:insideV w:val="single" w:sz="6" w:color="D8E1EC"/>
+            </w:tcBorders>
+          </w:tcPr>
+          <w:p>
+            <w:pPr>
+              <w:spacing w:before="40" w:after="40" w:line="240" w:lineRule="auto"/>
+              <w:jc w:val="center"/>
+              <w:keepNext/>
+            </w:pPr>
+            <w:r>
+              <w:rPr>
+                <w:rFonts w:ascii="Calibri" w:hAnsi="Calibri" w:eastAsia="Microsoft YaHei"/>
+                <w:b/>
+                <w:color w:val="FFFFFF"/>
+                <w:sz w:val="20"/>
+              </w:rPr>
+              <w:t>25 秒</w:t>
+            </w:r>
+          </w:p>
+        </w:tc>
+        <w:tc>
+          <w:tcPr>
+            <w:tcW w:type="dxa" w:w="8040"/>
+            <w:tcMar>
+              <w:top w:w="100" w:type="dxa"/>
+              <w:start w:w="120" w:type="dxa"/>
+              <w:bottom w:w="100" w:type="dxa"/>
+              <w:end w:w="120" w:type="dxa"/>
+            </w:tcMar>
+            <w:shd w:fill="F4F7FA"/>
+            <w:tcBorders>
+              <w:top w:val="single" w:sz="6" w:color="D8E1EC"/>
+              <w:start w:val="single" w:sz="6" w:color="D8E1EC"/>
+              <w:bottom w:val="single" w:sz="6" w:color="D8E1EC"/>
+              <w:end w:val="single" w:sz="6" w:color="D8E1EC"/>
+              <w:insideH w:val="single" w:sz="6" w:color="D8E1EC"/>
+              <w:insideV w:val="single" w:sz="6" w:color="D8E1EC"/>
+            </w:tcBorders>
+          </w:tcPr>
+          <w:p>
+            <w:pPr>
+              <w:spacing w:before="20" w:after="20" w:line="300" w:lineRule="auto"/>
+              <w:keepNext/>
+            </w:pPr>
+            <w:r>
+              <w:rPr>
+                <w:rFonts w:ascii="Calibri" w:hAnsi="Calibri" w:eastAsia="Microsoft YaHei"/>
+                <w:color w:val="1F2933"/>
+                <w:sz w:val="22"/>
+              </w:rPr>
+              <w:t>我们从实时感知的一个问题出发：画面、坐标和状态必须稳定地向后传递。沿着这条链路，算法先把现实看清，再把位置关系整理出来，最后把结果交给云台、虚拟球和角色动画。亿瞳智视想证明的是，国产 FPGA 可以在感知端提供确定性、低延迟、高并发的实时视觉处理。谢谢各位评委老师。</w:t>
+            </w:r>
+          </w:p>
+        </w:tc>
+      </w:tr>
+    </w:tbl>
     <w:p>
       <w:pPr>
-        <w:spacing w:line="300" w:lineRule="auto" w:after="100"/>
-        <w:ind w:firstLine="420"/>
-      </w:pPr>
-      <w:r>
-        <w:rPr>
-          <w:rFonts w:ascii="Microsoft YaHei" w:hAnsi="Microsoft YaHei" w:eastAsia="Microsoft YaHei"/>
-          <w:b w:val="0"/>
-          <w:sz w:val="21"/>
-        </w:rPr>
-        <w:t>要让虚拟映射可靠，第一步不是急着找红色或蓝色，而是先确定交互空间。FPGA 从连续 RGB565 像素流中提取地图黑框，通过区域约束、连续行段和外接矩形统计得到稳定边界。绿框确定以后，地图外像素全部排除，红色区域用于初始化虚拟球，蓝色区域用于跟踪手势。系统输出地图边界、目标中心、手势中心和工作模式，为后续空间映射提供统一坐标基础。</w:t>
-      </w:r>
-    </w:p>
-    <w:p>
-      <w:pPr>
-        <w:keepNext/>
-        <w:spacing w:before="160" w:after="20"/>
-      </w:pPr>
-      <w:r>
-        <w:rPr>
-          <w:rFonts w:ascii="Microsoft YaHei" w:hAnsi="Microsoft YaHei" w:eastAsia="Microsoft YaHei"/>
-          <w:b/>
-          <w:color w:val="103878"/>
-          <w:sz w:val="25"/>
-        </w:rPr>
-        <w:t>08｜基础算法组成</w:t>
-      </w:r>
-    </w:p>
-    <w:p>
-      <w:pPr>
-        <w:keepNext/>
         <w:spacing w:after="40"/>
       </w:pPr>
-      <w:r>
-        <w:rPr>
-          <w:rFonts w:ascii="Microsoft YaHei" w:hAnsi="Microsoft YaHei" w:eastAsia="Microsoft YaHei"/>
-          <w:b/>
-          <w:color w:val="323232"/>
-          <w:sz w:val="21"/>
-        </w:rPr>
-        <w:t>颜色、ROI、形态处理与时域跟踪组成抓取感知</w:t>
-      </w:r>
-    </w:p>
-    <w:p>
-      <w:pPr>
-        <w:spacing w:line="300" w:lineRule="auto" w:after="100"/>
-        <w:ind w:firstLine="420"/>
-      </w:pPr>
-      <w:r>
-        <w:rPr>
-          <w:rFonts w:ascii="Microsoft YaHei" w:hAnsi="Microsoft YaHei" w:eastAsia="Microsoft YaHei"/>
-          <w:b w:val="0"/>
-          <w:sz w:val="21"/>
-        </w:rPr>
-        <w:t>虚拟抓取不是黑盒识别。我们先进行 RGB 颜色阈值分类，再通过 ROI 排除交互地图外的干扰，结合腐蚀膨胀、连续行段筛选和外接矩形统计，得到目标中心；再通过时域跟踪提高稳定性。这里利用的是比赛场景中明确的矩形拓扑，换取可实时实现、可稳定跟踪的交互区域，而不是宣称任意环境下的通用轮廓识别。</w:t>
-      </w:r>
-    </w:p>
-    <w:p>
-      <w:pPr>
-        <w:keepNext/>
-        <w:spacing w:before="160" w:after="20"/>
-      </w:pPr>
-      <w:r>
-        <w:rPr>
-          <w:rFonts w:ascii="Microsoft YaHei" w:hAnsi="Microsoft YaHei" w:eastAsia="Microsoft YaHei"/>
-          <w:b/>
-          <w:color w:val="103878"/>
-          <w:sz w:val="25"/>
-        </w:rPr>
-        <w:t>09｜FPGA 与 PC 异构协同</w:t>
-      </w:r>
-    </w:p>
-    <w:p>
-      <w:pPr>
-        <w:keepNext/>
-        <w:spacing w:after="40"/>
-      </w:pPr>
-      <w:r>
-        <w:rPr>
-          <w:rFonts w:ascii="Microsoft YaHei" w:hAnsi="Microsoft YaHei" w:eastAsia="Microsoft YaHei"/>
-          <w:b/>
-          <w:color w:val="323232"/>
-          <w:sz w:val="21"/>
-        </w:rPr>
-        <w:t>FPGA 保证视觉时序，PC 负责三维空间解释</w:t>
-      </w:r>
-    </w:p>
-    <w:p>
-      <w:pPr>
-        <w:spacing w:line="300" w:lineRule="auto" w:after="100"/>
-        <w:ind w:firstLine="420"/>
-      </w:pPr>
-      <w:r>
-        <w:rPr>
-          <w:rFonts w:ascii="Microsoft YaHei" w:hAnsi="Microsoft YaHei" w:eastAsia="Microsoft YaHei"/>
-          <w:b w:val="0"/>
-          <w:sz w:val="21"/>
-        </w:rPr>
-        <w:t>这套系统没有把所有工作都压在 FPGA 上，而是按照任务特点进行异构分工。FPGA 负责摄像头采集、地图定位、颜色区域统计、外接矩形和质心输出；UART 双向传输二维坐标、状态和反馈坐标。PC 负责二维到三维的归一化映射、时域去抖、抓取状态机、释放速度计算和碰撞动画，再把虚拟球位置反向发送给 FPGA，由 FPGA 叠加到连续 HDMI 摄像头画面上。</w:t>
-      </w:r>
-    </w:p>
-    <w:p>
-      <w:pPr>
-        <w:keepNext/>
-        <w:spacing w:before="160" w:after="20"/>
-      </w:pPr>
-      <w:r>
-        <w:rPr>
-          <w:rFonts w:ascii="Microsoft YaHei" w:hAnsi="Microsoft YaHei" w:eastAsia="Microsoft YaHei"/>
-          <w:b/>
-          <w:color w:val="103878"/>
-          <w:sz w:val="25"/>
-        </w:rPr>
-        <w:t>10｜完整虚实闭环</w:t>
-      </w:r>
-    </w:p>
-    <w:p>
-      <w:pPr>
-        <w:keepNext/>
-        <w:spacing w:after="40"/>
-      </w:pPr>
-      <w:r>
-        <w:rPr>
-          <w:rFonts w:ascii="Microsoft YaHei" w:hAnsi="Microsoft YaHei" w:eastAsia="Microsoft YaHei"/>
-          <w:b/>
-          <w:color w:val="323232"/>
-          <w:sz w:val="21"/>
-        </w:rPr>
-        <w:t>感知、映射、交互与反馈形成连续链路</w:t>
-      </w:r>
-    </w:p>
-    <w:p>
-      <w:pPr>
-        <w:spacing w:line="300" w:lineRule="auto" w:after="100"/>
-        <w:ind w:firstLine="420"/>
-      </w:pPr>
-      <w:r>
-        <w:rPr>
-          <w:rFonts w:ascii="Microsoft YaHei" w:hAnsi="Microsoft YaHei" w:eastAsia="Microsoft YaHei"/>
-          <w:b w:val="0"/>
-          <w:sz w:val="21"/>
-        </w:rPr>
-        <w:t>从现实输入开始，系统依次完成地图定位、目标初始化、手势识别、坐标传输、三维映射、抓取、越线释放、速度继承和碰撞反馈。这里 FPGA 擅长逐像素、逐时钟的确定性处理，PC 擅长浮点计算与三维渲染，MCU 则适合执行端控制。分工之后，视觉链路不会被复杂的三维逻辑拖慢，同时又能把虚拟结果反馈回现场画面。</w:t>
-      </w:r>
-    </w:p>
-    <w:p>
-      <w:pPr>
-        <w:keepNext/>
-        <w:spacing w:before="160" w:after="20"/>
-      </w:pPr>
-      <w:r>
-        <w:rPr>
-          <w:rFonts w:ascii="Microsoft YaHei" w:hAnsi="Microsoft YaHei" w:eastAsia="Microsoft YaHei"/>
-          <w:b/>
-          <w:color w:val="103878"/>
-          <w:sz w:val="25"/>
-        </w:rPr>
-        <w:t>11｜应用价值</w:t>
-      </w:r>
-    </w:p>
-    <w:p>
-      <w:pPr>
-        <w:keepNext/>
-        <w:spacing w:after="40"/>
-      </w:pPr>
-      <w:r>
-        <w:rPr>
-          <w:rFonts w:ascii="Microsoft YaHei" w:hAnsi="Microsoft YaHei" w:eastAsia="Microsoft YaHei"/>
-          <w:b/>
-          <w:color w:val="323232"/>
-          <w:sz w:val="21"/>
-        </w:rPr>
-        <w:t>从虚拟抓取扩展到训练、数字孪生和沉浸式交互</w:t>
-      </w:r>
-    </w:p>
-    <w:p>
-      <w:pPr>
-        <w:spacing w:line="300" w:lineRule="auto" w:after="100"/>
-        <w:ind w:firstLine="420"/>
-      </w:pPr>
-      <w:r>
-        <w:rPr>
-          <w:rFonts w:ascii="Microsoft YaHei" w:hAnsi="Microsoft YaHei" w:eastAsia="Microsoft YaHei"/>
-          <w:b w:val="0"/>
-          <w:sz w:val="21"/>
-        </w:rPr>
-        <w:t>当前实现的是虚拟保龄球完整原型。它验证了普通摄像头、国产 FPGA 和实体标志物构成低成本空间交互入口的可行性。在 VR 训练中，可以记录动作轨迹、方向和释放速度；在数字孪生中，可以把实体位置同步到虚拟场景；在沉浸式游戏和远程操作中，也可以进一步把真实动作转换为交互或设备控制指令。这些是基于同一坐标与状态接口的扩展方向，不作为已经完成的功能夸大表述。</w:t>
-      </w:r>
-    </w:p>
-    <w:p>
-      <w:pPr>
-        <w:keepNext/>
-        <w:spacing w:before="160" w:after="20"/>
-      </w:pPr>
-      <w:r>
-        <w:rPr>
-          <w:rFonts w:ascii="Microsoft YaHei" w:hAnsi="Microsoft YaHei" w:eastAsia="Microsoft YaHei"/>
-          <w:b/>
-          <w:color w:val="103878"/>
-          <w:sz w:val="25"/>
-        </w:rPr>
-        <w:t>12｜实时任意角旋转</w:t>
-      </w:r>
-    </w:p>
-    <w:p>
-      <w:pPr>
-        <w:keepNext/>
-        <w:spacing w:after="40"/>
-      </w:pPr>
-      <w:r>
-        <w:rPr>
-          <w:rFonts w:ascii="Microsoft YaHei" w:hAnsi="Microsoft YaHei" w:eastAsia="Microsoft YaHei"/>
-          <w:b/>
-          <w:color w:val="323232"/>
-          <w:sz w:val="21"/>
-        </w:rPr>
-        <w:t>无 DDR 条件下，任意角度旋转改写为硬件友好结构</w:t>
-      </w:r>
-    </w:p>
-    <w:p>
-      <w:pPr>
-        <w:spacing w:line="300" w:lineRule="auto" w:after="100"/>
-        <w:ind w:firstLine="420"/>
-      </w:pPr>
-      <w:r>
-        <w:rPr>
-          <w:rFonts w:ascii="Microsoft YaHei" w:hAnsi="Microsoft YaHei" w:eastAsia="Microsoft YaHei"/>
-          <w:b w:val="0"/>
-          <w:sz w:val="21"/>
-        </w:rPr>
-        <w:t>除虚拟抓取外，我们还实现了独立的实时任意角旋转模式。旋转最大的难点是随机访问，而开发板没有 DDR。方案使用 480×270 的 16:9 工作集、RGB454 定点格式、双 Bank 奇偶列交错存储、Q8 三角函数查找和五级坐标流水，最后输出到 1280×720 HDMI。采用逆向坐标映射，显示端反向计算原图采样位置，避免正向映射常见的空洞。</w:t>
-      </w:r>
-    </w:p>
-    <w:p>
-      <w:pPr>
-        <w:keepNext/>
-        <w:spacing w:before="160" w:after="20"/>
-      </w:pPr>
-      <w:r>
-        <w:rPr>
-          <w:rFonts w:ascii="Microsoft YaHei" w:hAnsi="Microsoft YaHei" w:eastAsia="Microsoft YaHei"/>
-          <w:b/>
-          <w:color w:val="103878"/>
-          <w:sz w:val="25"/>
-        </w:rPr>
-        <w:t>13｜Retinex 数学模型</w:t>
-      </w:r>
-    </w:p>
-    <w:p>
-      <w:pPr>
-        <w:keepNext/>
-        <w:spacing w:after="40"/>
-      </w:pPr>
-      <w:r>
-        <w:rPr>
-          <w:rFonts w:ascii="Microsoft YaHei" w:hAnsi="Microsoft YaHei" w:eastAsia="Microsoft YaHei"/>
-          <w:b/>
-          <w:color w:val="323232"/>
-          <w:sz w:val="21"/>
-        </w:rPr>
-        <w:t>Retinex 先分离反射与照明，再映射为受限 Q8 增益</w:t>
-      </w:r>
-    </w:p>
-    <w:p>
-      <w:pPr>
-        <w:spacing w:line="300" w:lineRule="auto" w:after="100"/>
-        <w:ind w:firstLine="420"/>
-      </w:pPr>
-      <w:r>
-        <w:rPr>
-          <w:rFonts w:ascii="Microsoft YaHei" w:hAnsi="Microsoft YaHei" w:eastAsia="Microsoft YaHei"/>
-          <w:b w:val="0"/>
-          <w:sz w:val="21"/>
-        </w:rPr>
-        <w:t>理论模型是 I=R·L，取对数后 log₂R=log₂(I+1)-log₂(L̂+1)，把乘法关系变成减法关系。当前 RTL 先由 RGB 加权得到 Y=(77R+150G+29B)&gt;&gt;8，再用 3×3 加权高斯窗口估计局部照明，经过 Q8 log₂ 近似和增强亮度计算，量化为 1.00 到 1.50 倍的五级增益，并完成 RGB、同步信号和数据使能的 13 周期对齐。</w:t>
-      </w:r>
-    </w:p>
-    <w:p>
-      <w:pPr>
-        <w:keepNext/>
-        <w:spacing w:before="160" w:after="20"/>
-      </w:pPr>
-      <w:r>
-        <w:rPr>
-          <w:rFonts w:ascii="Microsoft YaHei" w:hAnsi="Microsoft YaHei" w:eastAsia="Microsoft YaHei"/>
-          <w:b/>
-          <w:color w:val="103878"/>
-          <w:sz w:val="25"/>
-        </w:rPr>
-        <w:t>14｜Retinex 效果</w:t>
-      </w:r>
-    </w:p>
-    <w:p>
-      <w:pPr>
-        <w:keepNext/>
-        <w:spacing w:after="40"/>
-      </w:pPr>
-      <w:r>
-        <w:rPr>
-          <w:rFonts w:ascii="Microsoft YaHei" w:hAnsi="Microsoft YaHei" w:eastAsia="Microsoft YaHei"/>
-          <w:b/>
-          <w:color w:val="323232"/>
-          <w:sz w:val="21"/>
-        </w:rPr>
-        <w:t>暗部结构恢复，同时保持场景整体色彩关系</w:t>
-      </w:r>
-    </w:p>
-    <w:p>
-      <w:pPr>
-        <w:spacing w:line="300" w:lineRule="auto" w:after="100"/>
-        <w:ind w:firstLine="420"/>
-      </w:pPr>
-      <w:r>
-        <w:rPr>
-          <w:rFonts w:ascii="Microsoft YaHei" w:hAnsi="Microsoft YaHei" w:eastAsia="Microsoft YaHei"/>
-          <w:b w:val="0"/>
-          <w:sz w:val="21"/>
-        </w:rPr>
-        <w:t>增强前的暗区结构、桌面边缘和远处纹理被阴影覆盖；增强后暗部细节重新可见，高亮区域没有被无限放大。Retinex 不是简单拉高亮度，而是利用局部照明与反射分解改善可见性，并通过受限增益保护亮区，最终以 RGB565 流水方式实时输出。</w:t>
-      </w:r>
-    </w:p>
-    <w:p>
-      <w:pPr>
-        <w:keepNext/>
-        <w:spacing w:before="160" w:after="20"/>
-      </w:pPr>
-      <w:r>
-        <w:rPr>
-          <w:rFonts w:ascii="Microsoft YaHei" w:hAnsi="Microsoft YaHei" w:eastAsia="Microsoft YaHei"/>
-          <w:b/>
-          <w:color w:val="103878"/>
-          <w:sz w:val="25"/>
-        </w:rPr>
-        <w:t>15｜多曝光融合</w:t>
-      </w:r>
-    </w:p>
-    <w:p>
-      <w:pPr>
-        <w:keepNext/>
-        <w:spacing w:after="40"/>
-      </w:pPr>
-      <w:r>
-        <w:rPr>
-          <w:rFonts w:ascii="Microsoft YaHei" w:hAnsi="Microsoft YaHei" w:eastAsia="Microsoft YaHei"/>
-          <w:b/>
-          <w:color w:val="323232"/>
-          <w:sz w:val="21"/>
-        </w:rPr>
-        <w:t>在 YCbCr 亮度域兼顾高光和暗部</w:t>
-      </w:r>
-    </w:p>
-    <w:p>
-      <w:pPr>
-        <w:spacing w:line="300" w:lineRule="auto" w:after="100"/>
-        <w:ind w:firstLine="420"/>
-      </w:pPr>
-      <w:r>
-        <w:rPr>
-          <w:rFonts w:ascii="Microsoft YaHei" w:hAnsi="Microsoft YaHei" w:eastAsia="Microsoft YaHei"/>
-          <w:b w:val="0"/>
-          <w:sz w:val="21"/>
-        </w:rPr>
-        <w:t>低曝光结果保留高光，高曝光结果补充暗部，再根据 Y 通道的亮度可信度进行选择和加权，让同一幅输出同时保留亮部与暗部层次。多曝光与 Retinex 是独立模式，便于按场景切换，也避免把所有增强任务串成一条过重的链路。</w:t>
-      </w:r>
-    </w:p>
-    <w:p>
-      <w:pPr>
-        <w:keepNext/>
-        <w:spacing w:before="160" w:after="20"/>
-      </w:pPr>
-      <w:r>
-        <w:rPr>
-          <w:rFonts w:ascii="Microsoft YaHei" w:hAnsi="Microsoft YaHei" w:eastAsia="Microsoft YaHei"/>
-          <w:b/>
-          <w:color w:val="103878"/>
-          <w:sz w:val="25"/>
-        </w:rPr>
-        <w:t>16｜激光云台效果</w:t>
-      </w:r>
-    </w:p>
-    <w:p>
-      <w:pPr>
-        <w:keepNext/>
-        <w:spacing w:after="40"/>
-      </w:pPr>
-      <w:r>
-        <w:rPr>
-          <w:rFonts w:ascii="Microsoft YaHei" w:hAnsi="Microsoft YaHei" w:eastAsia="Microsoft YaHei"/>
-          <w:b/>
-          <w:color w:val="323232"/>
-          <w:sz w:val="21"/>
-        </w:rPr>
-        <w:t>从肉眼亮点到可用坐标，再送往云台控制端</w:t>
-      </w:r>
-    </w:p>
-    <w:p>
-      <w:pPr>
-        <w:spacing w:line="300" w:lineRule="auto" w:after="100"/>
-        <w:ind w:firstLine="420"/>
-      </w:pPr>
-      <w:r>
-        <w:rPr>
-          <w:rFonts w:ascii="Microsoft YaHei" w:hAnsi="Microsoft YaHei" w:eastAsia="Microsoft YaHei"/>
-          <w:b w:val="0"/>
-          <w:sz w:val="21"/>
-        </w:rPr>
-        <w:t>在激光打靶场景中，难点不是找到最亮的像素，而是复杂反光也可能非常亮。系统先利用有效靶区限制搜索范围，再筛选高亮核心。FPGA 输出稳定坐标，通过接口送往 F407 和云台执行端，画面中同时看到检测反馈和实际控制结果。</w:t>
-      </w:r>
-    </w:p>
-    <w:p>
-      <w:pPr>
-        <w:keepNext/>
-        <w:spacing w:before="160" w:after="20"/>
-      </w:pPr>
-      <w:r>
-        <w:rPr>
-          <w:rFonts w:ascii="Microsoft YaHei" w:hAnsi="Microsoft YaHei" w:eastAsia="Microsoft YaHei"/>
-          <w:b/>
-          <w:color w:val="103878"/>
-          <w:sz w:val="25"/>
-        </w:rPr>
-        <w:t>17｜激光追踪难点与创新</w:t>
-      </w:r>
-    </w:p>
-    <w:p>
-      <w:pPr>
-        <w:keepNext/>
-        <w:spacing w:after="40"/>
-      </w:pPr>
-      <w:r>
-        <w:rPr>
-          <w:rFonts w:ascii="Microsoft YaHei" w:hAnsi="Microsoft YaHei" w:eastAsia="Microsoft YaHei"/>
-          <w:b/>
-          <w:color w:val="323232"/>
-          <w:sz w:val="21"/>
-        </w:rPr>
-        <w:t>激光追踪不是单一阈值，而是空间、峰值和时域联合约束</w:t>
-      </w:r>
-    </w:p>
-    <w:p>
-      <w:pPr>
-        <w:spacing w:line="300" w:lineRule="auto" w:after="100"/>
-        <w:ind w:firstLine="420"/>
-      </w:pPr>
-      <w:r>
-        <w:rPr>
-          <w:rFonts w:ascii="Microsoft YaHei" w:hAnsi="Microsoft YaHei" w:eastAsia="Microsoft YaHei"/>
-          <w:b w:val="0"/>
-          <w:sz w:val="21"/>
-        </w:rPr>
-        <w:t>反光和饱和伪点通过 YCbCr 蓝色种子与 Y≥220 高亮核心双通道候选抑制；背景误检通过动态 ROI、游程长度 6 到 96、种子数量和峰值像素数量约束；抖动和短时丢点通过 3 帧确认、±24 像素跟踪门、2 像素死区、四分之一平滑和 6 帧保持稳定。实际 RTL 选择最强峰值游程中心，而不是泛化的 blob centroid。最后用帧 ID 双槽配对，计算光点和靶心的 Δx、Δy，交给 MCU 形成闭环。</w:t>
-      </w:r>
-    </w:p>
-    <w:p>
-      <w:pPr>
-        <w:keepNext/>
-        <w:spacing w:before="160" w:after="20"/>
-      </w:pPr>
-      <w:r>
-        <w:rPr>
-          <w:rFonts w:ascii="Microsoft YaHei" w:hAnsi="Microsoft YaHei" w:eastAsia="Microsoft YaHei"/>
-          <w:b/>
-          <w:color w:val="103878"/>
-          <w:sz w:val="25"/>
-        </w:rPr>
-        <w:t>18｜赛题指标对应</w:t>
-      </w:r>
-    </w:p>
-    <w:p>
-      <w:pPr>
-        <w:keepNext/>
-        <w:spacing w:after="40"/>
-      </w:pPr>
-      <w:r>
-        <w:rPr>
-          <w:rFonts w:ascii="Microsoft YaHei" w:hAnsi="Microsoft YaHei" w:eastAsia="Microsoft YaHei"/>
-          <w:b/>
-          <w:color w:val="323232"/>
-          <w:sz w:val="21"/>
-        </w:rPr>
-        <w:t>围绕指标完成，并在算法、接口和应用层进一步扩展</w:t>
-      </w:r>
-    </w:p>
-    <w:p>
-      <w:pPr>
-        <w:spacing w:line="300" w:lineRule="auto" w:after="100"/>
-        <w:ind w:firstLine="420"/>
-      </w:pPr>
-      <w:r>
-        <w:rPr>
-          <w:rFonts w:ascii="Microsoft YaHei" w:hAnsi="Microsoft YaHei" w:eastAsia="Microsoft YaHei"/>
-          <w:b w:val="0"/>
-          <w:sz w:val="21"/>
-        </w:rPr>
-        <w:t>我们的任务是围绕赛题指标完成的。视频链路完成 OV5640 到 FPGA 再到 1280×720 HDMI 的连续输出；在规定显示与处理基础上，进一步扩展了 Retinex、多曝光、实时旋转、虚拟抓取和激光云台；接口覆盖摄像头、HDMI、UART、Ethernet 和 MCU 控制链；处理路径通过定点化、流水线和帧边界切换保证连续输出。</w:t>
-      </w:r>
-    </w:p>
-    <w:p>
-      <w:pPr>
-        <w:keepNext/>
-        <w:spacing w:before="160" w:after="20"/>
-      </w:pPr>
-      <w:r>
-        <w:rPr>
-          <w:rFonts w:ascii="Microsoft YaHei" w:hAnsi="Microsoft YaHei" w:eastAsia="Microsoft YaHei"/>
-          <w:b/>
-          <w:color w:val="103878"/>
-          <w:sz w:val="25"/>
-        </w:rPr>
-        <w:t>19｜资源占用率</w:t>
-      </w:r>
-    </w:p>
-    <w:p>
-      <w:pPr>
-        <w:keepNext/>
-        <w:spacing w:after="40"/>
-      </w:pPr>
-      <w:r>
-        <w:rPr>
-          <w:rFonts w:ascii="Microsoft YaHei" w:hAnsi="Microsoft YaHei" w:eastAsia="Microsoft YaHei"/>
-          <w:b/>
-          <w:color w:val="323232"/>
-          <w:sz w:val="21"/>
-        </w:rPr>
-        <w:t>多算法并行并未换来资源失控，DSP 仅占约 4%</w:t>
-      </w:r>
-    </w:p>
-    <w:p>
-      <w:pPr>
-        <w:spacing w:line="300" w:lineRule="auto" w:after="100"/>
-        <w:ind w:firstLine="420"/>
-      </w:pPr>
-      <w:r>
-        <w:rPr>
-          <w:rFonts w:ascii="Microsoft YaHei" w:hAnsi="Microsoft YaHei" w:eastAsia="Microsoft YaHei"/>
-          <w:b w:val="0"/>
-          <w:sz w:val="21"/>
-        </w:rPr>
-        <w:t>当前工程数据中，逻辑单元 29,534，约占 22%；片上存储 1,925,952 bit，约 1.93 Mbit；DSP 使用 2 个，占 48 个资源的约 4%。我们没有依赖 DDR 堆叠功能，而是通过片上窗口、定点化和查表实现多模式处理，并为后续扩展保留空间。上位机关键协议测试 22/22 通过，说明坐标、状态和反馈链路具备可核验的工程基础。</w:t>
-      </w:r>
-    </w:p>
-    <w:p>
-      <w:pPr>
-        <w:keepNext/>
-        <w:spacing w:before="160" w:after="20"/>
-      </w:pPr>
-      <w:r>
-        <w:rPr>
-          <w:rFonts w:ascii="Microsoft YaHei" w:hAnsi="Microsoft YaHei" w:eastAsia="Microsoft YaHei"/>
-          <w:b/>
-          <w:color w:val="103878"/>
-          <w:sz w:val="25"/>
-        </w:rPr>
-        <w:t>20｜开发难点</w:t>
-      </w:r>
-    </w:p>
-    <w:p>
-      <w:pPr>
-        <w:keepNext/>
-        <w:spacing w:after="40"/>
-      </w:pPr>
-      <w:r>
-        <w:rPr>
-          <w:rFonts w:ascii="Microsoft YaHei" w:hAnsi="Microsoft YaHei" w:eastAsia="Microsoft YaHei"/>
-          <w:b/>
-          <w:color w:val="323232"/>
-          <w:sz w:val="21"/>
-        </w:rPr>
-        <w:t>四类工程难点最终转化为可复用硬件架构</w:t>
-      </w:r>
-    </w:p>
-    <w:p>
-      <w:pPr>
-        <w:spacing w:line="300" w:lineRule="auto" w:after="100"/>
-        <w:ind w:firstLine="420"/>
-      </w:pPr>
-      <w:r>
-        <w:rPr>
-          <w:rFonts w:ascii="Microsoft YaHei" w:hAnsi="Microsoft YaHei" w:eastAsia="Microsoft YaHei"/>
-          <w:b w:val="0"/>
-          <w:sz w:val="21"/>
-        </w:rPr>
-        <w:t>第一，无 DDR 时随机访问受限，通过工作集和双 Bank 结构解决；第二，Retinex、旋转和多曝光等复杂算法需要窗口、近似和定点化硬件实现；第三，多时钟视频需要 FIFO、流水对齐和帧边界切换保持连续；第四，激光反光、手势抖动和短时丢点需要 ROI、时域稳定和闭环状态管理。我们把这些困难转化为可复用的模块和接口，而不是停留在离线算法验证。</w:t>
-      </w:r>
-    </w:p>
-    <w:p>
-      <w:pPr>
-        <w:keepNext/>
-        <w:spacing w:before="160" w:after="20"/>
-      </w:pPr>
-      <w:r>
-        <w:rPr>
-          <w:rFonts w:ascii="Microsoft YaHei" w:hAnsi="Microsoft YaHei" w:eastAsia="Microsoft YaHei"/>
-          <w:b/>
-          <w:color w:val="103878"/>
-          <w:sz w:val="25"/>
-        </w:rPr>
-        <w:t>21｜工程证据</w:t>
-      </w:r>
-    </w:p>
-    <w:p>
-      <w:pPr>
-        <w:keepNext/>
-        <w:spacing w:after="40"/>
-      </w:pPr>
-      <w:r>
-        <w:rPr>
-          <w:rFonts w:ascii="Microsoft YaHei" w:hAnsi="Microsoft YaHei" w:eastAsia="Microsoft YaHei"/>
-          <w:b/>
-          <w:color w:val="323232"/>
-          <w:sz w:val="21"/>
-        </w:rPr>
-        <w:t>指标、资源和现场验证形成完整闭环</w:t>
-      </w:r>
-    </w:p>
-    <w:p>
-      <w:pPr>
-        <w:spacing w:line="300" w:lineRule="auto" w:after="100"/>
-        <w:ind w:firstLine="420"/>
-      </w:pPr>
-      <w:r>
-        <w:rPr>
-          <w:rFonts w:ascii="Microsoft YaHei" w:hAnsi="Microsoft YaHei" w:eastAsia="Microsoft YaHei"/>
-          <w:b w:val="0"/>
-          <w:sz w:val="21"/>
-        </w:rPr>
-        <w:t>这里集中汇总可核验的数据：1280×720 完整链路、480×270 旋转工作集、Q8 LUT、坐标流水、高斯照明估计、13 周期对齐、29,534 逻辑单元、1.93 Mbit 片上存储、2/48 DSP，以及上位机 22/22 协议测试通过。虚拟抓取闭环、算法对比和激光云台也可以现场演示。</w:t>
-      </w:r>
-    </w:p>
-    <w:p>
-      <w:pPr>
-        <w:keepNext/>
-        <w:spacing w:before="160" w:after="20"/>
-      </w:pPr>
-      <w:r>
-        <w:rPr>
-          <w:rFonts w:ascii="Microsoft YaHei" w:hAnsi="Microsoft YaHei" w:eastAsia="Microsoft YaHei"/>
-          <w:b/>
-          <w:color w:val="103878"/>
-          <w:sz w:val="25"/>
-        </w:rPr>
-        <w:t>22｜团队分工</w:t>
-      </w:r>
-    </w:p>
-    <w:p>
-      <w:pPr>
-        <w:keepNext/>
-        <w:spacing w:after="40"/>
-      </w:pPr>
-      <w:r>
-        <w:rPr>
-          <w:rFonts w:ascii="Microsoft YaHei" w:hAnsi="Microsoft YaHei" w:eastAsia="Microsoft YaHei"/>
-          <w:b/>
-          <w:color w:val="323232"/>
-          <w:sz w:val="21"/>
-        </w:rPr>
-        <w:t>视觉、交互、增强和执行端协同完成系统</w:t>
-      </w:r>
-    </w:p>
-    <w:p>
-      <w:pPr>
-        <w:spacing w:line="300" w:lineRule="auto" w:after="100"/>
-        <w:ind w:firstLine="420"/>
-      </w:pPr>
-      <w:r>
-        <w:rPr>
-          <w:rFonts w:ascii="Microsoft YaHei" w:hAnsi="Microsoft YaHei" w:eastAsia="Microsoft YaHei"/>
-          <w:b w:val="0"/>
-          <w:sz w:val="21"/>
-        </w:rPr>
-        <w:t>项目采用模块化分工：一部分负责视觉链路和旋转，另一部分负责 Retinex 与多曝光，第三部分负责虚拟抓取、激光云台和 MCU 执行。最终通过统一接口把各模块合并成完整系统。这样的分工既保证算法模块独立验证，也保证最终演示能够围绕同一套采集、通信和显示底座协同运行。</w:t>
-      </w:r>
-    </w:p>
-    <w:p>
-      <w:pPr>
-        <w:keepNext/>
-        <w:spacing w:before="160" w:after="20"/>
-      </w:pPr>
-      <w:r>
-        <w:rPr>
-          <w:rFonts w:ascii="Microsoft YaHei" w:hAnsi="Microsoft YaHei" w:eastAsia="Microsoft YaHei"/>
-          <w:b/>
-          <w:color w:val="103878"/>
-          <w:sz w:val="25"/>
-        </w:rPr>
-        <w:t>23｜总结</w:t>
-      </w:r>
-    </w:p>
-    <w:p>
-      <w:pPr>
-        <w:keepNext/>
-        <w:spacing w:after="40"/>
-      </w:pPr>
-      <w:r>
-        <w:rPr>
-          <w:rFonts w:ascii="Microsoft YaHei" w:hAnsi="Microsoft YaHei" w:eastAsia="Microsoft YaHei"/>
-          <w:b/>
-          <w:color w:val="323232"/>
-          <w:sz w:val="21"/>
-        </w:rPr>
-        <w:t>国产 FPGA 既能看清现实，也能理解空间并驱动交互</w:t>
-      </w:r>
-    </w:p>
-    <w:p>
-      <w:pPr>
-        <w:spacing w:line="300" w:lineRule="auto" w:after="100"/>
-        <w:ind w:firstLine="420"/>
-      </w:pPr>
-      <w:r>
-        <w:rPr>
-          <w:rFonts w:ascii="Microsoft YaHei" w:hAnsi="Microsoft YaHei" w:eastAsia="Microsoft YaHei"/>
-          <w:b w:val="0"/>
-          <w:sz w:val="21"/>
-        </w:rPr>
-        <w:t>我们不仅完成了从采集到显示的基础要求，还把视觉算法落实为可复用、可验证、可交互的硬件系统。虚拟物品抓取把现实中的图像、目标和动作稳定带入虚拟空间并形成反馈；Retinex、多曝光、旋转和激光追踪则证明同一底座可以支撑不同视觉问题。通过确定性实时链路，国产 FPGA 可以成为现实世界与虚拟空间之间的视觉入口。</w:t>
-      </w:r>
-    </w:p>
-    <w:p>
-      <w:pPr>
-        <w:keepNext/>
-        <w:spacing w:before="160" w:after="20"/>
-      </w:pPr>
-      <w:r>
-        <w:rPr>
-          <w:rFonts w:ascii="Microsoft YaHei" w:hAnsi="Microsoft YaHei" w:eastAsia="Microsoft YaHei"/>
-          <w:b/>
-          <w:color w:val="103878"/>
-          <w:sz w:val="25"/>
-        </w:rPr>
-        <w:t>24｜结束页</w:t>
-      </w:r>
-    </w:p>
-    <w:p>
-      <w:pPr>
-        <w:keepNext/>
-        <w:spacing w:after="40"/>
-      </w:pPr>
-      <w:r>
-        <w:rPr>
-          <w:rFonts w:ascii="Microsoft YaHei" w:hAnsi="Microsoft YaHei" w:eastAsia="Microsoft YaHei"/>
-          <w:b/>
-          <w:color w:val="323232"/>
-          <w:sz w:val="21"/>
-        </w:rPr>
-        <w:t>感谢各位评审</w:t>
-      </w:r>
-    </w:p>
-    <w:p>
-      <w:pPr>
-        <w:spacing w:line="300" w:lineRule="auto" w:after="100"/>
-        <w:ind w:firstLine="420"/>
-      </w:pPr>
-      <w:r>
-        <w:rPr>
-          <w:rFonts w:ascii="Microsoft YaHei" w:hAnsi="Microsoft YaHei" w:eastAsia="Microsoft YaHei"/>
-          <w:b w:val="0"/>
-          <w:sz w:val="21"/>
-        </w:rPr>
-        <w:t>以上是我们的项目汇报，感谢各位评委的聆听。我们愿意继续回答关于虚拟抓取主线、算法实现、硬件架构、资源占用、时序设计和现场演示的问题。</w:t>
-      </w:r>
     </w:p>
     <w:sectPr>
       <w:footerReference w:type="default" r:id="rId9"/>
       <w:pgSz w:w="12240" w:h="15840"/>
-      <w:pgMar w:top="964" w:right="1134" w:bottom="907" w:left="1134" w:header="720" w:footer="720" w:gutter="0"/>
+      <w:pgMar w:top="1080" w:right="1224" w:bottom="1080" w:left="1224" w:header="504" w:footer="504" w:gutter="0"/>
       <w:cols w:space="720"/>
       <w:docGrid w:linePitch="360"/>
     </w:sectPr>
@@ -1118,16 +2011,15 @@
   <w:p>
     <w:pPr>
       <w:pStyle w:val="Footer"/>
-      <w:jc w:val="center"/>
+      <w:jc w:val="right"/>
     </w:pPr>
     <w:r>
       <w:rPr>
-        <w:rFonts w:ascii="Microsoft YaHei" w:hAnsi="Microsoft YaHei" w:eastAsia="Microsoft YaHei"/>
-        <w:b w:val="0"/>
-        <w:color w:val="787878"/>
+        <w:rFonts w:ascii="Calibri" w:hAnsi="Calibri" w:eastAsia="Microsoft YaHei"/>
+        <w:color w:val="7A8796"/>
         <w:sz w:val="17"/>
       </w:rPr>
-      <w:t>CICC1001959｜亿瞳智视｜区域赛决赛演讲稿</w:t>
+      <w:t>亿瞳智视｜CICC1001959｜决赛答辩讲稿</w:t>
     </w:r>
   </w:p>
 </w:ftr>
@@ -1496,6 +2388,13 @@
     <w:name w:val="Normal"/>
     <w:qFormat/>
     <w:rsid w:val="00FC693F"/>
+    <w:pPr>
+      <w:spacing w:after="120" w:line="300" w:lineRule="auto"/>
+    </w:pPr>
+    <w:rPr>
+      <w:rFonts w:ascii="Calibri" w:hAnsi="Calibri" w:eastAsia="Microsoft YaHei"/>
+      <w:sz w:val="22"/>
+    </w:rPr>
   </w:style>
   <w:style w:type="paragraph" w:styleId="Header">
     <w:name w:val="header"/>
@@ -1552,15 +2451,15 @@
     <w:pPr>
       <w:keepNext/>
       <w:keepLines/>
-      <w:spacing w:before="480" w:after="0"/>
+      <w:spacing w:before="320" w:after="140"/>
       <w:outlineLvl w:val="0"/>
     </w:pPr>
     <w:rPr>
-      <w:rFonts w:asciiTheme="majorHAnsi" w:eastAsiaTheme="majorEastAsia" w:hAnsiTheme="majorHAnsi" w:cstheme="majorBidi"/>
+      <w:rFonts w:asciiTheme="majorHAnsi" w:eastAsiaTheme="majorEastAsia" w:hAnsiTheme="majorHAnsi" w:cstheme="majorBidi" w:ascii="Calibri" w:hAnsi="Calibri" w:eastAsia="Microsoft YaHei"/>
       <w:b/>
       <w:bCs/>
-      <w:color w:val="365F91" w:themeColor="accent1" w:themeShade="BF"/>
-      <w:sz w:val="28"/>
+      <w:color w:val="1459A6"/>
+      <w:sz w:val="32"/>
       <w:szCs w:val="28"/>
     </w:rPr>
   </w:style>
@@ -1576,14 +2475,14 @@
     <w:pPr>
       <w:keepNext/>
       <w:keepLines/>
-      <w:spacing w:before="200" w:after="0"/>
+      <w:spacing w:before="240" w:after="100"/>
       <w:outlineLvl w:val="1"/>
     </w:pPr>
     <w:rPr>
-      <w:rFonts w:asciiTheme="majorHAnsi" w:eastAsiaTheme="majorEastAsia" w:hAnsiTheme="majorHAnsi" w:cstheme="majorBidi"/>
+      <w:rFonts w:asciiTheme="majorHAnsi" w:eastAsiaTheme="majorEastAsia" w:hAnsiTheme="majorHAnsi" w:cstheme="majorBidi" w:ascii="Calibri" w:hAnsi="Calibri" w:eastAsia="Microsoft YaHei"/>
       <w:b/>
       <w:bCs/>
-      <w:color w:val="4F81BD" w:themeColor="accent1"/>
+      <w:color w:val="1F4D78"/>
       <w:sz w:val="26"/>
       <w:szCs w:val="26"/>
     </w:rPr>

</xml_diff>